<commit_message>
revision2: add synthetic reachability-vs-probability crossover figure (Figure A1, Appendix A)
Adds the single-panel synthetic mechanism illustration (density-minus-reconstruction difficult-subset
AUROC gap vs fault in-envelope-ness, at three regime separations) as Figure A1 in Appendix A, clearly
captioned as synthetic and cross-referenced from the Section 6 density-vs-reconstruction paragraph. It
illustrates the crossover (reconstruction wins off-manifold, density wins between-regime) without
claiming a predictive law. Build rasterizes 4/4 figures cleanly.

Co-Authored-By: Claude Opus 4.8 <noreply@anthropic.com>
</commit_message>
<xml_diff>
--- a/poc/paper/paper_mdpi.docx
+++ b/poc/paper/paper_mdpi.docx
@@ -20229,7 +20229,31 @@
         <w:rPr>
           <w:highlight w:val="green"/>
         </w:rPr>
-        <w:t xml:space="preserve">which is why the community factorization, not the head, carries the WADI gain. A reconstruction residual</w:t>
+        <w:t xml:space="preserve">which is why the community factorization, not the head, carries the WADI gain.</w:t>
+      </w:r>
+      <w:r>
+        <w:rPr>
+          <w:highlight w:val="green"/>
+        </w:rPr>
+        <w:t xml:space="preserve"> </w:t>
+      </w:r>
+      <w:r>
+        <w:rPr>
+          <w:highlight w:val="green"/>
+        </w:rPr>
+        <w:t xml:space="preserve">Figure A1 illustrates this reachability-versus-probability crossover on synthetic data.</w:t>
+      </w:r>
+      <w:r>
+        <w:rPr>
+          <w:highlight w:val="green"/>
+        </w:rPr>
+        <w:t xml:space="preserve"> </w:t>
+      </w:r>
+      <w:r>
+        <w:rPr>
+          <w:highlight w:val="green"/>
+        </w:rPr>
+        <w:t xml:space="preserve">A reconstruction residual</w:t>
       </w:r>
       <w:r>
         <w:rPr>
@@ -25907,6 +25931,139 @@
         </w:tc>
       </w:tr>
     </w:tbl>
+    <w:tbl xmlns:a="http://schemas.openxmlformats.org/drawingml/2006/main" xmlns:pic="http://schemas.openxmlformats.org/drawingml/2006/picture">
+      <w:tblPr>
+        <w:tblStyle w:val="MDPI41threelinetable"/>
+        <w:tblW w:w="7858" w:type="dxa"/>
+        <w:jc w:val="left"/>
+        <w:tblInd w:w="2608" w:type="dxa"/>
+        <w:tblLayout w:type="fixed"/>
+        <w:tblCellMar>
+          <w:left w:w="60" w:type="dxa"/>
+          <w:right w:w="60" w:type="dxa"/>
+        </w:tblCellMar>
+        <w:tblLook w:val="0420" w:firstRow="1" w:lastRow="0" w:firstColumn="0" w:lastColumn="0" w:noHBand="0" w:noVBand="1"/>
+      </w:tblPr>
+      <w:tblGrid>
+        <w:gridCol w:w="3918"/>
+        <w:gridCol w:w="3940"/>
+      </w:tblGrid>
+      <w:tr>
+        <w:tc>
+          <w:tcPr>
+            <w:tcBorders>
+              <w:bottom w:val="single" w:sz="8" w:space="0" w:color="auto"/>
+            </w:tcBorders>
+            <w:vAlign w:val="center"/>
+          </w:tcPr>
+          <w:p>
+            <w:pPr>
+              <w:pStyle w:val="Compact"/>
+              <w:suppressAutoHyphens/>
+              <w:jc w:val="center"/>
+            </w:pPr>
+            <w:r>
+              <w:rPr>
+                <w:b/>
+                <w:sz w:val="18"/>
+                <w:szCs w:val="18"/>
+                <w:highlight w:val="green"/>
+              </w:rPr>
+              <w:t xml:space="preserve"> </w:t>
+            </w:r>
+            <w:r>
+              <w:rPr>
+                <w:b/>
+                <w:sz w:val="18"/>
+                <w:szCs w:val="18"/>
+                <w:highlight w:val="green"/>
+              </w:rPr>
+              <w:drawing>
+                <wp:inline>
+                  <wp:extent cx="2971800" cy="2020823"/>
+                  <wp:effectExtent b="0" l="0" r="0" t="0"/>
+                  <wp:docPr descr="figure" title="" id="46" name="Picture"/>
+                  <a:graphic>
+                    <a:graphicData uri="http://schemas.openxmlformats.org/drawingml/2006/picture">
+                      <pic:pic>
+                        <pic:nvPicPr>
+                          <pic:cNvPr descr="_inlinesvg_3.png" id="47" name="Picture"/>
+                          <pic:cNvPicPr>
+                            <a:picLocks noChangeArrowheads="1" noChangeAspect="1"/>
+                          </pic:cNvPicPr>
+                        </pic:nvPicPr>
+                        <pic:blipFill>
+                          <a:blip r:embed="rId22"/>
+                          <a:stretch>
+                            <a:fillRect/>
+                          </a:stretch>
+                        </pic:blipFill>
+                        <pic:spPr bwMode="auto">
+                          <a:xfrm>
+                            <a:off x="0" y="0"/>
+                            <a:ext cx="2971800" cy="2020823"/>
+                          </a:xfrm>
+                          <a:prstGeom prst="rect">
+                            <a:avLst/>
+                          </a:prstGeom>
+                          <a:noFill/>
+                          <a:ln w="9525">
+                            <a:noFill/>
+                            <a:headEnd/>
+                            <a:tailEnd/>
+                          </a:ln>
+                        </pic:spPr>
+                      </pic:pic>
+                    </a:graphicData>
+                  </a:graphic>
+                </wp:inline>
+              </w:drawing>
+            </w:r>
+          </w:p>
+        </w:tc>
+        <w:tc>
+          <w:tcPr>
+            <w:tcBorders>
+              <w:bottom w:val="single" w:sz="8" w:space="0" w:color="auto"/>
+            </w:tcBorders>
+            <w:vAlign w:val="center"/>
+          </w:tcPr>
+          <w:p>
+            <w:pPr>
+              <w:pStyle w:val="Compact"/>
+              <w:suppressAutoHyphens/>
+              <w:jc w:val="center"/>
+            </w:pPr>
+          </w:p>
+        </w:tc>
+      </w:tr>
+    </w:tbl>
+    <w:p>
+      <w:pPr>
+        <w:pStyle w:val="MDPI51figurecaption"/>
+        <w:ind w:left="2608"/>
+      </w:pPr>
+      <w:r>
+        <w:rPr>
+          <w:b/>
+          <w:bCs/>
+          <w:highlight w:val="green"/>
+        </w:rPr>
+        <w:t xml:space="preserve">Figure A1.</w:t>
+      </w:r>
+      <w:r>
+        <w:rPr>
+          <w:highlight w:val="green"/>
+        </w:rPr>
+        <w:t xml:space="preserve"> </w:t>
+      </w:r>
+      <w:r>
+        <w:rPr>
+          <w:highlight w:val="green"/>
+        </w:rPr>
+        <w:t xml:space="preserve">Synthetic illustration of the reachability-versus-probability mechanism. On toy data with five Gaussian regimes, the difficult-subset gap between a latent-density score and a reconstruction score (AUROC density minus AUROC reconstruction) is plotted as a fault moves from off-manifold (reconstructable and caught by reconstruction) to between-regime (reconstructable but improbable), at three regime separations. Density overtakes reconstruction as faults become more in-envelope, and the crossover is earlier for better-separated regimes. This is a synthetic mechanism illustration, not a claim about the benchmarks.</w:t>
+      </w:r>
+    </w:p>
     <w:p>
       <w:pPr>
         <w:pStyle w:val="MDPI21heading1"/>
@@ -28738,7 +28895,7 @@
         </w:numPr>
         <w:ind w:left="180" w:hanging="180"/>
       </w:pPr>
-      <w:bookmarkStart w:id="49" w:name="r-chandola"/>
+      <w:bookmarkStart w:id="52" w:name="r-chandola"/>
       <w:r>
         <w:rPr/>
         <w:t xml:space="preserve">Chandola, V.; Banerjee, A.; Kumar, V. Anomaly detection: A survey.</w:t>
@@ -28788,7 +28945,7 @@
         <w:rPr/>
         <w:t xml:space="preserve"> </w:t>
       </w:r>
-      <w:hyperlink r:id="rId22">
+      <w:hyperlink r:id="rId23">
         <w:r>
           <w:rPr>
             <w:rStyle w:val="Hyperlink"/>
@@ -28800,7 +28957,7 @@
         <w:rPr/>
         <w:t xml:space="preserve">.</w:t>
       </w:r>
-      <w:bookmarkEnd w:id="49"/>
+      <w:bookmarkEnd w:id="52"/>
     </w:p>
     <w:p>
       <w:pPr>
@@ -28811,7 +28968,7 @@
         </w:numPr>
         <w:ind w:left="180" w:hanging="180"/>
       </w:pPr>
-      <w:bookmarkStart w:id="51" w:name="r-pang"/>
+      <w:bookmarkStart w:id="54" w:name="r-pang"/>
       <w:r>
         <w:rPr/>
         <w:t xml:space="preserve">Pang, G.; Shen, C.; Cao, L.; van den Hengel, A. Deep learning for anomaly detection: A review.</w:t>
@@ -28861,7 +29018,7 @@
         <w:rPr/>
         <w:t xml:space="preserve"> </w:t>
       </w:r>
-      <w:hyperlink r:id="rId23">
+      <w:hyperlink r:id="rId24">
         <w:r>
           <w:rPr>
             <w:rStyle w:val="Hyperlink"/>
@@ -28873,7 +29030,7 @@
         <w:rPr/>
         <w:t xml:space="preserve">.</w:t>
       </w:r>
-      <w:bookmarkEnd w:id="51"/>
+      <w:bookmarkEnd w:id="54"/>
     </w:p>
     <w:p>
       <w:pPr>
@@ -28884,7 +29041,7 @@
         </w:numPr>
         <w:ind w:left="180" w:hanging="180"/>
       </w:pPr>
-      <w:bookmarkStart w:id="53" w:name="r-ruff"/>
+      <w:bookmarkStart w:id="56" w:name="r-ruff"/>
       <w:r>
         <w:rPr/>
         <w:t xml:space="preserve">Ruff, L.; Kauffmann, J.R.; Vandermeulen, R.A.; Montavon, G.; Samek, W.; Kloft, M.; Dietterich, T.G.; Müller, K.-R. A unifying review of deep and shallow anomaly detection.</w:t>
@@ -28934,7 +29091,7 @@
         <w:rPr/>
         <w:t xml:space="preserve"> </w:t>
       </w:r>
-      <w:hyperlink r:id="rId24">
+      <w:hyperlink r:id="rId25">
         <w:r>
           <w:rPr>
             <w:rStyle w:val="Hyperlink"/>
@@ -28946,7 +29103,7 @@
         <w:rPr/>
         <w:t xml:space="preserve">.</w:t>
       </w:r>
-      <w:bookmarkEnd w:id="53"/>
+      <w:bookmarkEnd w:id="56"/>
     </w:p>
     <w:p>
       <w:pPr>
@@ -28957,7 +29114,7 @@
         </w:numPr>
         <w:ind w:left="180" w:hanging="180"/>
       </w:pPr>
-      <w:bookmarkStart w:id="55" w:name="r-iotsurvey"/>
+      <w:bookmarkStart w:id="58" w:name="r-iotsurvey"/>
       <w:r>
         <w:rPr>
           <w:highlight w:val="yellow"/>
@@ -29024,7 +29181,7 @@
         </w:rPr>
         <w:t xml:space="preserve"> </w:t>
       </w:r>
-      <w:hyperlink r:id="rId25">
+      <w:hyperlink r:id="rId26">
         <w:r>
           <w:rPr>
             <w:rStyle w:val="Hyperlink"/>
@@ -29039,7 +29196,7 @@
         </w:rPr>
         <w:t xml:space="preserve">.</w:t>
       </w:r>
-      <w:bookmarkEnd w:id="55"/>
+      <w:bookmarkEnd w:id="58"/>
     </w:p>
     <w:p>
       <w:pPr>
@@ -29050,7 +29207,7 @@
         </w:numPr>
         <w:ind w:left="180" w:hanging="180"/>
       </w:pPr>
-      <w:bookmarkStart w:id="57" w:name="r-iottaxon"/>
+      <w:bookmarkStart w:id="60" w:name="r-iottaxon"/>
       <w:r>
         <w:rPr>
           <w:highlight w:val="yellow"/>
@@ -29117,7 +29274,7 @@
         </w:rPr>
         <w:t xml:space="preserve"> </w:t>
       </w:r>
-      <w:hyperlink r:id="rId26">
+      <w:hyperlink r:id="rId27">
         <w:r>
           <w:rPr>
             <w:rStyle w:val="Hyperlink"/>
@@ -29132,7 +29289,7 @@
         </w:rPr>
         <w:t xml:space="preserve">.</w:t>
       </w:r>
-      <w:bookmarkEnd w:id="57"/>
+      <w:bookmarkEnd w:id="60"/>
     </w:p>
     <w:p>
       <w:pPr>
@@ -29143,7 +29300,7 @@
         </w:numPr>
         <w:ind w:left="180" w:hanging="180"/>
       </w:pPr>
-      <w:bookmarkStart w:id="59" w:name="r-iotae"/>
+      <w:bookmarkStart w:id="62" w:name="r-iotae"/>
       <w:r>
         <w:rPr>
           <w:highlight w:val="yellow"/>
@@ -29210,7 +29367,7 @@
         </w:rPr>
         <w:t xml:space="preserve"> </w:t>
       </w:r>
-      <w:hyperlink r:id="rId27">
+      <w:hyperlink r:id="rId28">
         <w:r>
           <w:rPr>
             <w:rStyle w:val="Hyperlink"/>
@@ -29225,7 +29382,7 @@
         </w:rPr>
         <w:t xml:space="preserve">.</w:t>
       </w:r>
-      <w:bookmarkEnd w:id="59"/>
+      <w:bookmarkEnd w:id="62"/>
     </w:p>
     <w:p>
       <w:pPr>
@@ -29236,7 +29393,7 @@
         </w:numPr>
         <w:ind w:left="180" w:hanging="180"/>
       </w:pPr>
-      <w:bookmarkStart w:id="61" w:name="r-kim"/>
+      <w:bookmarkStart w:id="64" w:name="r-kim"/>
       <w:r>
         <w:rPr/>
         <w:t xml:space="preserve">Kim, S.; Choi, K.; Choi, H.-S.; Lee, B.; Yoon, S. Towards a rigorous evaluation of time-series anomaly detection. In Proceedings of the AAAI Conference on Artificial Intelligence, Virtual, 22 February–1 March 2022; Volume 36, pp. 7194–7201.</w:t>
@@ -29245,7 +29402,7 @@
         <w:rPr/>
         <w:t xml:space="preserve"> </w:t>
       </w:r>
-      <w:hyperlink r:id="rId28">
+      <w:hyperlink r:id="rId29">
         <w:r>
           <w:rPr>
             <w:rStyle w:val="Hyperlink"/>
@@ -29257,7 +29414,7 @@
         <w:rPr/>
         <w:t xml:space="preserve">.</w:t>
       </w:r>
-      <w:bookmarkEnd w:id="61"/>
+      <w:bookmarkEnd w:id="64"/>
     </w:p>
     <w:p>
       <w:pPr>
@@ -29268,7 +29425,7 @@
         </w:numPr>
         <w:ind w:left="180" w:hanging="180"/>
       </w:pPr>
-      <w:bookmarkStart w:id="63" w:name="r-garg"/>
+      <w:bookmarkStart w:id="66" w:name="r-garg"/>
       <w:r>
         <w:rPr/>
         <w:t xml:space="preserve">Garg, A.; Zhang, W.; Samaran, J.; Savitha, R.; Foo, C.-S. An evaluation of anomaly detection and diagnosis in multivariate time series.</w:t>
@@ -29318,7 +29475,7 @@
         <w:rPr/>
         <w:t xml:space="preserve"> </w:t>
       </w:r>
-      <w:hyperlink r:id="rId29">
+      <w:hyperlink r:id="rId30">
         <w:r>
           <w:rPr>
             <w:rStyle w:val="Hyperlink"/>
@@ -29330,7 +29487,7 @@
         <w:rPr/>
         <w:t xml:space="preserve">.</w:t>
       </w:r>
-      <w:bookmarkEnd w:id="63"/>
+      <w:bookmarkEnd w:id="66"/>
     </w:p>
     <w:p>
       <w:pPr>
@@ -29341,7 +29498,7 @@
         </w:numPr>
         <w:ind w:left="180" w:hanging="180"/>
       </w:pPr>
-      <w:bookmarkStart w:id="65" w:name="r-wukeogh"/>
+      <w:bookmarkStart w:id="68" w:name="r-wukeogh"/>
       <w:r>
         <w:rPr/>
         <w:t xml:space="preserve">Wu, R.; Keogh, E.J. Current time series anomaly detection benchmarks are flawed and are creating the illusion of progress.</w:t>
@@ -29391,7 +29548,7 @@
         <w:rPr/>
         <w:t xml:space="preserve"> </w:t>
       </w:r>
-      <w:hyperlink r:id="rId30">
+      <w:hyperlink r:id="rId31">
         <w:r>
           <w:rPr>
             <w:rStyle w:val="Hyperlink"/>
@@ -29403,7 +29560,7 @@
         <w:rPr/>
         <w:t xml:space="preserve">.</w:t>
       </w:r>
-      <w:bookmarkEnd w:id="65"/>
+      <w:bookmarkEnd w:id="68"/>
     </w:p>
     <w:p>
       <w:pPr>
@@ -29414,7 +29571,7 @@
         </w:numPr>
         <w:ind w:left="180" w:hanging="180"/>
       </w:pPr>
-      <w:bookmarkStart w:id="67" w:name="r-incip"/>
+      <w:bookmarkStart w:id="70" w:name="r-incip"/>
       <w:r>
         <w:rPr>
           <w:highlight w:val="green"/>
@@ -29481,7 +29638,7 @@
         </w:rPr>
         <w:t xml:space="preserve"> </w:t>
       </w:r>
-      <w:hyperlink r:id="rId31">
+      <w:hyperlink r:id="rId32">
         <w:r>
           <w:rPr>
             <w:rStyle w:val="Hyperlink"/>
@@ -29496,7 +29653,7 @@
         </w:rPr>
         <w:t xml:space="preserve">.</w:t>
       </w:r>
-      <w:bookmarkEnd w:id="67"/>
+      <w:bookmarkEnd w:id="70"/>
     </w:p>
     <w:p>
       <w:pPr>
@@ -29507,7 +29664,7 @@
         </w:numPr>
         <w:ind w:left="180" w:hanging="180"/>
       </w:pPr>
-      <w:bookmarkStart w:id="69" w:name="r-bdg2"/>
+      <w:bookmarkStart w:id="72" w:name="r-bdg2"/>
       <w:r>
         <w:rPr>
           <w:highlight w:val="green"/>
@@ -29574,7 +29731,7 @@
         </w:rPr>
         <w:t xml:space="preserve"> </w:t>
       </w:r>
-      <w:hyperlink r:id="rId32">
+      <w:hyperlink r:id="rId33">
         <w:r>
           <w:rPr>
             <w:rStyle w:val="Hyperlink"/>
@@ -29589,7 +29746,7 @@
         </w:rPr>
         <w:t xml:space="preserve">.</w:t>
       </w:r>
-      <w:bookmarkEnd w:id="69"/>
+      <w:bookmarkEnd w:id="72"/>
     </w:p>
     <w:p>
       <w:pPr>
@@ -29600,7 +29757,7 @@
         </w:numPr>
         <w:ind w:left="180" w:hanging="180"/>
       </w:pPr>
-      <w:bookmarkStart w:id="71" w:name="r-tsreview"/>
+      <w:bookmarkStart w:id="74" w:name="r-tsreview"/>
       <w:r>
         <w:rPr/>
         <w:t xml:space="preserve">Blázquez-García, A.; Conde, A.; Mori, U.; Lozano, J.A. A review on outlier/anomaly detection in time series data.</w:t>
@@ -29650,7 +29807,7 @@
         <w:rPr/>
         <w:t xml:space="preserve"> </w:t>
       </w:r>
-      <w:hyperlink r:id="rId33">
+      <w:hyperlink r:id="rId34">
         <w:r>
           <w:rPr>
             <w:rStyle w:val="Hyperlink"/>
@@ -29662,7 +29819,7 @@
         <w:rPr/>
         <w:t xml:space="preserve">.</w:t>
       </w:r>
-      <w:bookmarkEnd w:id="71"/>
+      <w:bookmarkEnd w:id="74"/>
     </w:p>
     <w:p>
       <w:pPr>
@@ -29673,7 +29830,7 @@
         </w:numPr>
         <w:ind w:left="180" w:hanging="180"/>
       </w:pPr>
-      <w:bookmarkStart w:id="73" w:name="r-icssurvey"/>
+      <w:bookmarkStart w:id="76" w:name="r-icssurvey"/>
       <w:r>
         <w:rPr/>
         <w:t xml:space="preserve">Hu, Y.; Yang, A.; Li, H.; Sun, Y.; Sun, L. A survey of intrusion detection on industrial control systems.</w:t>
@@ -29723,7 +29880,7 @@
         <w:rPr/>
         <w:t xml:space="preserve"> </w:t>
       </w:r>
-      <w:hyperlink r:id="rId34">
+      <w:hyperlink r:id="rId35">
         <w:r>
           <w:rPr>
             <w:rStyle w:val="Hyperlink"/>
@@ -29735,7 +29892,7 @@
         <w:rPr/>
         <w:t xml:space="preserve">.</w:t>
       </w:r>
-      <w:bookmarkEnd w:id="73"/>
+      <w:bookmarkEnd w:id="76"/>
     </w:p>
     <w:p>
       <w:pPr>
@@ -29746,7 +29903,7 @@
         </w:numPr>
         <w:ind w:left="180" w:hanging="180"/>
       </w:pPr>
-      <w:bookmarkStart w:id="75" w:name="r-tsadreview"/>
+      <w:bookmarkStart w:id="78" w:name="r-tsadreview"/>
       <w:r>
         <w:rPr>
           <w:highlight w:val="yellow"/>
@@ -29813,7 +29970,7 @@
         </w:rPr>
         <w:t xml:space="preserve"> </w:t>
       </w:r>
-      <w:hyperlink r:id="rId35">
+      <w:hyperlink r:id="rId36">
         <w:r>
           <w:rPr>
             <w:rStyle w:val="Hyperlink"/>
@@ -29828,7 +29985,7 @@
         </w:rPr>
         <w:t xml:space="preserve">.</w:t>
       </w:r>
-      <w:bookmarkEnd w:id="75"/>
+      <w:bookmarkEnd w:id="78"/>
     </w:p>
     <w:p>
       <w:pPr>
@@ -29839,7 +29996,7 @@
         </w:numPr>
         <w:ind w:left="180" w:hanging="180"/>
       </w:pPr>
-      <w:bookmarkStart w:id="77" w:name="r-edgeint"/>
+      <w:bookmarkStart w:id="80" w:name="r-edgeint"/>
       <w:r>
         <w:rPr>
           <w:highlight w:val="yellow"/>
@@ -29906,7 +30063,7 @@
         </w:rPr>
         <w:t xml:space="preserve"> </w:t>
       </w:r>
-      <w:hyperlink r:id="rId36">
+      <w:hyperlink r:id="rId37">
         <w:r>
           <w:rPr>
             <w:rStyle w:val="Hyperlink"/>
@@ -29921,7 +30078,7 @@
         </w:rPr>
         <w:t xml:space="preserve">.</w:t>
       </w:r>
-      <w:bookmarkEnd w:id="77"/>
+      <w:bookmarkEnd w:id="80"/>
     </w:p>
     <w:p>
       <w:pPr>
@@ -29932,7 +30089,7 @@
         </w:numPr>
         <w:ind w:left="180" w:hanging="180"/>
       </w:pPr>
-      <w:bookmarkStart w:id="79" w:name="r-iotlora"/>
+      <w:bookmarkStart w:id="82" w:name="r-iotlora"/>
       <w:r>
         <w:rPr>
           <w:highlight w:val="yellow"/>
@@ -29999,7 +30156,7 @@
         </w:rPr>
         <w:t xml:space="preserve"> </w:t>
       </w:r>
-      <w:hyperlink r:id="rId37">
+      <w:hyperlink r:id="rId38">
         <w:r>
           <w:rPr>
             <w:rStyle w:val="Hyperlink"/>
@@ -30014,7 +30171,7 @@
         </w:rPr>
         <w:t xml:space="preserve">.</w:t>
       </w:r>
-      <w:bookmarkEnd w:id="79"/>
+      <w:bookmarkEnd w:id="82"/>
     </w:p>
     <w:p>
       <w:pPr>
@@ -30025,7 +30182,7 @@
         </w:numPr>
         <w:ind w:left="180" w:hanging="180"/>
       </w:pPr>
-      <w:bookmarkStart w:id="81" w:name="r-iotedgeai"/>
+      <w:bookmarkStart w:id="84" w:name="r-iotedgeai"/>
       <w:r>
         <w:rPr>
           <w:highlight w:val="yellow"/>
@@ -30092,7 +30249,7 @@
         </w:rPr>
         <w:t xml:space="preserve"> </w:t>
       </w:r>
-      <w:hyperlink r:id="rId38">
+      <w:hyperlink r:id="rId39">
         <w:r>
           <w:rPr>
             <w:rStyle w:val="Hyperlink"/>
@@ -30107,7 +30264,7 @@
         </w:rPr>
         <w:t xml:space="preserve">.</w:t>
       </w:r>
-      <w:bookmarkEnd w:id="81"/>
+      <w:bookmarkEnd w:id="84"/>
     </w:p>
     <w:p>
       <w:pPr>
@@ -30118,7 +30275,7 @@
         </w:numPr>
         <w:ind w:left="180" w:hanging="180"/>
       </w:pPr>
-      <w:bookmarkStart w:id="83" w:name="r-islam"/>
+      <w:bookmarkStart w:id="86" w:name="r-islam"/>
       <w:r>
         <w:rPr>
           <w:highlight w:val="green"/>
@@ -30165,7 +30322,7 @@
         </w:rPr>
         <w:t xml:space="preserve"> </w:t>
       </w:r>
-      <w:hyperlink r:id="rId39">
+      <w:hyperlink r:id="rId40">
         <w:r>
           <w:rPr>
             <w:rStyle w:val="Hyperlink"/>
@@ -30180,7 +30337,7 @@
         </w:rPr>
         <w:t xml:space="preserve">.</w:t>
       </w:r>
-      <w:bookmarkEnd w:id="83"/>
+      <w:bookmarkEnd w:id="86"/>
     </w:p>
     <w:p>
       <w:pPr>
@@ -30191,7 +30348,7 @@
         </w:numPr>
         <w:ind w:left="180" w:hanging="180"/>
       </w:pPr>
-      <w:bookmarkStart w:id="85" w:name="r-doshi"/>
+      <w:bookmarkStart w:id="88" w:name="r-doshi"/>
       <w:r>
         <w:rPr/>
         <w:t xml:space="preserve">Doshi, K.; Abudalou, S.; Yilmaz, Y. Reward once, penalize once: Rectifying time series anomaly detection. In Proceedings of the International Joint Conference on Neural Networks (IJCNN), Padua, Italy, 18–23 July 2022.</w:t>
@@ -30200,7 +30357,7 @@
         <w:rPr/>
         <w:t xml:space="preserve"> </w:t>
       </w:r>
-      <w:hyperlink r:id="rId40">
+      <w:hyperlink r:id="rId41">
         <w:r>
           <w:rPr>
             <w:rStyle w:val="Hyperlink"/>
@@ -30212,7 +30369,7 @@
         <w:rPr/>
         <w:t xml:space="preserve">.</w:t>
       </w:r>
-      <w:bookmarkEnd w:id="85"/>
+      <w:bookmarkEnd w:id="88"/>
     </w:p>
     <w:p>
       <w:pPr>
@@ -30223,7 +30380,7 @@
         </w:numPr>
         <w:ind w:left="180" w:hanging="180"/>
       </w:pPr>
-      <w:bookmarkStart w:id="87" w:name="r-pate"/>
+      <w:bookmarkStart w:id="90" w:name="r-pate"/>
       <w:r>
         <w:rPr/>
         <w:t xml:space="preserve">Ghorbani, R.; Reinders, M.J.T.; Tax, D.M.J. PATE: Proximity-aware time series anomaly evaluation. In Proceedings of the 30th ACM SIGKDD Conference on Knowledge Discovery and Data Mining (KDD), Barcelona, Spain, 25–29 August 2024; pp. 872–883.</w:t>
@@ -30232,7 +30389,7 @@
         <w:rPr/>
         <w:t xml:space="preserve"> </w:t>
       </w:r>
-      <w:hyperlink r:id="rId41">
+      <w:hyperlink r:id="rId42">
         <w:r>
           <w:rPr>
             <w:rStyle w:val="Hyperlink"/>
@@ -30244,7 +30401,7 @@
         <w:rPr/>
         <w:t xml:space="preserve">.</w:t>
       </w:r>
-      <w:bookmarkEnd w:id="87"/>
+      <w:bookmarkEnd w:id="90"/>
     </w:p>
     <w:p>
       <w:pPr>
@@ -30255,7 +30412,7 @@
         </w:numPr>
         <w:ind w:left="180" w:hanging="180"/>
       </w:pPr>
-      <w:bookmarkStart w:id="89" w:name="r-univar"/>
+      <w:bookmarkStart w:id="92" w:name="r-univar"/>
       <w:r>
         <w:rPr/>
         <w:t xml:space="preserve">Pinet, M.; Cumin, J.; Berlemont, S.; Vaufreydaz, D. Anomalies in multivariate time series benchmarks are mostly univariate.</w:t>
@@ -30290,7 +30447,7 @@
         <w:rPr/>
         <w:t xml:space="preserve"> </w:t>
       </w:r>
-      <w:hyperlink r:id="rId42">
+      <w:hyperlink r:id="rId43">
         <w:r>
           <w:rPr>
             <w:rStyle w:val="Hyperlink"/>
@@ -30302,7 +30459,7 @@
         <w:rPr/>
         <w:t xml:space="preserve">.</w:t>
       </w:r>
-      <w:bookmarkEnd w:id="89"/>
+      <w:bookmarkEnd w:id="92"/>
     </w:p>
     <w:p>
       <w:pPr>
@@ -30313,7 +30470,7 @@
         </w:numPr>
         <w:ind w:left="180" w:hanging="180"/>
       </w:pPr>
-      <w:bookmarkStart w:id="91" w:name="r-tab"/>
+      <w:bookmarkStart w:id="94" w:name="r-tab"/>
       <w:r>
         <w:rPr/>
         <w:t xml:space="preserve">Qiu, X.; Li, Z.; Wu, X.; Hu, J.; Guo, C.; Yang, B.; Jensen, C.S. TAB: Unified benchmarking of time series anomaly detection methods.</w:t>
@@ -30348,7 +30505,7 @@
         <w:rPr/>
         <w:t xml:space="preserve"> </w:t>
       </w:r>
-      <w:hyperlink r:id="rId43">
+      <w:hyperlink r:id="rId44">
         <w:r>
           <w:rPr>
             <w:rStyle w:val="Hyperlink"/>
@@ -30360,7 +30517,7 @@
         <w:rPr/>
         <w:t xml:space="preserve">.</w:t>
       </w:r>
-      <w:bookmarkEnd w:id="91"/>
+      <w:bookmarkEnd w:id="94"/>
     </w:p>
     <w:p>
       <w:pPr>
@@ -30371,7 +30528,7 @@
         </w:numPr>
         <w:ind w:left="180" w:hanging="180"/>
       </w:pPr>
-      <w:bookmarkStart w:id="93" w:name="r-bouman"/>
+      <w:bookmarkStart w:id="96" w:name="r-bouman"/>
       <w:r>
         <w:rPr/>
         <w:t xml:space="preserve">Bouman, R.; Heskes, T. Autoencoders for anomaly detection are unreliable.</w:t>
@@ -30406,7 +30563,7 @@
         <w:rPr/>
         <w:t xml:space="preserve"> </w:t>
       </w:r>
-      <w:hyperlink r:id="rId44">
+      <w:hyperlink r:id="rId45">
         <w:r>
           <w:rPr>
             <w:rStyle w:val="Hyperlink"/>
@@ -30418,7 +30575,7 @@
         <w:rPr/>
         <w:t xml:space="preserve">.</w:t>
       </w:r>
-      <w:bookmarkEnd w:id="93"/>
+      <w:bookmarkEnd w:id="96"/>
     </w:p>
     <w:p>
       <w:pPr>
@@ -30429,7 +30586,7 @@
         </w:numPr>
         <w:ind w:left="180" w:hanging="180"/>
       </w:pPr>
-      <w:bookmarkStart w:id="95" w:name="r-memae"/>
+      <w:bookmarkStart w:id="98" w:name="r-memae"/>
       <w:r>
         <w:rPr/>
         <w:t xml:space="preserve">Gong, D.; Liu, L.; Le, V.; Saha, B.; Mansour, M.R.; Venkatesh, S.; van den Hengel, A. Memorizing normality to detect anomaly: Memory-augmented deep autoencoder for unsupervised anomaly detection. In Proceedings of the IEEE/CVF International Conference on Computer Vision (ICCV), Seoul, Republic of Korea, 27 October–2 November 2019; pp. 1705–1714.</w:t>
@@ -30438,7 +30595,7 @@
         <w:rPr/>
         <w:t xml:space="preserve"> </w:t>
       </w:r>
-      <w:hyperlink r:id="rId45">
+      <w:hyperlink r:id="rId46">
         <w:r>
           <w:rPr>
             <w:rStyle w:val="Hyperlink"/>
@@ -30450,7 +30607,7 @@
         <w:rPr/>
         <w:t xml:space="preserve">.</w:t>
       </w:r>
-      <w:bookmarkEnd w:id="95"/>
+      <w:bookmarkEnd w:id="98"/>
     </w:p>
     <w:p>
       <w:pPr>
@@ -30461,7 +30618,7 @@
         </w:numPr>
         <w:ind w:left="180" w:hanging="180"/>
       </w:pPr>
-      <w:bookmarkStart w:id="97" w:name="r-sarfraz"/>
+      <w:bookmarkStart w:id="100" w:name="r-sarfraz"/>
       <w:r>
         <w:rPr/>
         <w:t xml:space="preserve">Sarfraz, M.S.; Chen, M.-Y.; Layer, L.; Peng, K.; Koulakis, M. Position: Quo vadis, unsupervised time series anomaly detection? In Proceedings of the 41st International Conference on Machine Learning (ICML), Vienna, Austria, 21–27 July 2024.</w:t>
@@ -30470,7 +30627,7 @@
         <w:rPr/>
         <w:t xml:space="preserve"> </w:t>
       </w:r>
-      <w:hyperlink r:id="rId46">
+      <w:hyperlink r:id="rId47">
         <w:r>
           <w:rPr>
             <w:rStyle w:val="Hyperlink"/>
@@ -30482,7 +30639,7 @@
         <w:rPr/>
         <w:t xml:space="preserve">.</w:t>
       </w:r>
-      <w:bookmarkEnd w:id="97"/>
+      <w:bookmarkEnd w:id="100"/>
     </w:p>
     <w:p>
       <w:pPr>
@@ -30493,7 +30650,7 @@
         </w:numPr>
         <w:ind w:left="180" w:hanging="180"/>
       </w:pPr>
-      <w:bookmarkStart w:id="99" w:name="r-timesead"/>
+      <w:bookmarkStart w:id="102" w:name="r-timesead"/>
       <w:r>
         <w:rPr/>
         <w:t xml:space="preserve">Wagner, D.; Michels, T.; Schulz, F.C.F.; Nair, A.; Rudolph, M.; Kloft, M. TimeSeAD: Benchmarking deep multivariate time-series anomaly detection.</w:t>
@@ -30528,7 +30685,7 @@
         <w:rPr/>
         <w:t xml:space="preserve"> </w:t>
       </w:r>
-      <w:hyperlink r:id="rId47">
+      <w:hyperlink r:id="rId48">
         <w:r>
           <w:rPr>
             <w:rStyle w:val="Hyperlink"/>
@@ -30540,7 +30697,7 @@
         <w:rPr/>
         <w:t xml:space="preserve">.</w:t>
       </w:r>
-      <w:bookmarkEnd w:id="99"/>
+      <w:bookmarkEnd w:id="102"/>
     </w:p>
     <w:p>
       <w:pPr>
@@ -30551,7 +30708,7 @@
         </w:numPr>
         <w:ind w:left="180" w:hanging="180"/>
       </w:pPr>
-      <w:bookmarkStart w:id="101" w:name="r-vade"/>
+      <w:bookmarkStart w:id="104" w:name="r-vade"/>
       <w:r>
         <w:rPr/>
         <w:t xml:space="preserve">Jiang, Z.; Zheng, Y.; Tan, H.; Tang, B.; Zhou, H. Variational deep embedding: An unsupervised and generative approach to clustering. In Proceedings of the 26th International Joint Conference on Artificial Intelligence (IJCAI), Melbourne, Australia, 19–25 August 2017; pp. 1965–1972.</w:t>
@@ -30560,7 +30717,7 @@
         <w:rPr/>
         <w:t xml:space="preserve"> </w:t>
       </w:r>
-      <w:hyperlink r:id="rId48">
+      <w:hyperlink r:id="rId49">
         <w:r>
           <w:rPr>
             <w:rStyle w:val="Hyperlink"/>
@@ -30571,76 +30728,6 @@
       <w:r>
         <w:rPr/>
         <w:t xml:space="preserve">.</w:t>
-      </w:r>
-      <w:bookmarkEnd w:id="101"/>
-    </w:p>
-    <w:p>
-      <w:pPr>
-        <w:pStyle w:val="MDPI81references"/>
-        <w:numPr>
-          <w:ilvl w:val="0"/>
-          <w:numId w:val="0"/>
-        </w:numPr>
-        <w:ind w:left="180" w:hanging="180"/>
-      </w:pPr>
-      <w:bookmarkStart w:id="103" w:name="r-dagmm"/>
-      <w:r>
-        <w:rPr/>
-        <w:t xml:space="preserve">Zong, B.; Song, Q.; Min, M.R.; Cheng, W.; Lumezanu, C.; Cho, D.; Chen, H. Deep autoencoding Gaussian mixture model for unsupervised anomaly detection. In Proceedings of the International Conference on Learning Representations (ICLR), Vancouver, BC, Canada, 30 April–3 May 2018.</w:t>
-      </w:r>
-      <w:r>
-        <w:rPr/>
-        <w:t xml:space="preserve"> </w:t>
-      </w:r>
-      <w:hyperlink r:id="rId49">
-        <w:r>
-          <w:rPr>
-            <w:rStyle w:val="Hyperlink"/>
-          </w:rPr>
-          <w:t xml:space="preserve">https://openreview.net/forum?id=BJJLHbb0-</w:t>
-        </w:r>
-      </w:hyperlink>
-      <w:r>
-        <w:rPr/>
-        <w:t xml:space="preserve">.</w:t>
-      </w:r>
-      <w:bookmarkEnd w:id="103"/>
-    </w:p>
-    <w:p>
-      <w:pPr>
-        <w:pStyle w:val="MDPI81references"/>
-        <w:numPr>
-          <w:ilvl w:val="0"/>
-          <w:numId w:val="0"/>
-        </w:numPr>
-        <w:ind w:left="180" w:hanging="180"/>
-      </w:pPr>
-      <w:bookmarkStart w:id="104" w:name="r-deepsvdd"/>
-      <w:r>
-        <w:rPr>
-          <w:highlight w:val="green"/>
-        </w:rPr>
-        <w:t xml:space="preserve">Ruff, L.; Vandermeulen, R.A.; Görnitz, N.; Deecke, L.; Siddiqui, S.A.; Binder, A.; Müller, E.; Kloft, M. Deep one-class classification. In</w:t>
-      </w:r>
-      <w:r>
-        <w:rPr>
-          <w:highlight w:val="green"/>
-        </w:rPr>
-        <w:t xml:space="preserve"> </w:t>
-      </w:r>
-      <w:r>
-        <w:rPr>
-          <w:i/>
-          <w:iCs/>
-          <w:highlight w:val="green"/>
-        </w:rPr>
-        <w:t xml:space="preserve">Proceedings of the 35th International Conference on Machine Learning (ICML)</w:t>
-      </w:r>
-      <w:r>
-        <w:rPr>
-          <w:highlight w:val="green"/>
-        </w:rPr>
-        <w:t xml:space="preserve">, Stockholm, Sweden, 10–15 July 2018; PMLR, Vol. 80, pp. 4393–4402.</w:t>
       </w:r>
       <w:bookmarkEnd w:id="104"/>
     </w:p>
@@ -30653,34 +30740,28 @@
         </w:numPr>
         <w:ind w:left="180" w:hanging="180"/>
       </w:pPr>
-      <w:bookmarkStart w:id="105" w:name="r-thoc"/>
-      <w:r>
-        <w:rPr>
-          <w:highlight w:val="green"/>
-        </w:rPr>
-        <w:t xml:space="preserve">Shen, L.; Li, Z.; Kwok, J.T. Timeseries anomaly detection using temporal hierarchical one-class network. In</w:t>
-      </w:r>
-      <w:r>
-        <w:rPr>
-          <w:highlight w:val="green"/>
-        </w:rPr>
-        <w:t xml:space="preserve"> </w:t>
-      </w:r>
-      <w:r>
-        <w:rPr>
-          <w:i/>
-          <w:iCs/>
-          <w:highlight w:val="green"/>
-        </w:rPr>
-        <w:t xml:space="preserve">Advances in Neural Information Processing Systems 33 (NeurIPS)</w:t>
-      </w:r>
-      <w:r>
-        <w:rPr>
-          <w:highlight w:val="green"/>
-        </w:rPr>
-        <w:t xml:space="preserve">, Online, 6–12 December 2020; pp. 13016–13026.</w:t>
-      </w:r>
-      <w:bookmarkEnd w:id="105"/>
+      <w:bookmarkStart w:id="106" w:name="r-dagmm"/>
+      <w:r>
+        <w:rPr/>
+        <w:t xml:space="preserve">Zong, B.; Song, Q.; Min, M.R.; Cheng, W.; Lumezanu, C.; Cho, D.; Chen, H. Deep autoencoding Gaussian mixture model for unsupervised anomaly detection. In Proceedings of the International Conference on Learning Representations (ICLR), Vancouver, BC, Canada, 30 April–3 May 2018.</w:t>
+      </w:r>
+      <w:r>
+        <w:rPr/>
+        <w:t xml:space="preserve"> </w:t>
+      </w:r>
+      <w:hyperlink r:id="rId50">
+        <w:r>
+          <w:rPr>
+            <w:rStyle w:val="Hyperlink"/>
+          </w:rPr>
+          <w:t xml:space="preserve">https://openreview.net/forum?id=BJJLHbb0-</w:t>
+        </w:r>
+      </w:hyperlink>
+      <w:r>
+        <w:rPr/>
+        <w:t xml:space="preserve">.</w:t>
+      </w:r>
+      <w:bookmarkEnd w:id="106"/>
     </w:p>
     <w:p>
       <w:pPr>
@@ -30691,12 +30772,12 @@
         </w:numPr>
         <w:ind w:left="180" w:hanging="180"/>
       </w:pPr>
-      <w:bookmarkStart w:id="107" w:name="r-omni"/>
-      <w:r>
-        <w:rPr>
-          <w:highlight w:val="green"/>
-        </w:rPr>
-        <w:t xml:space="preserve">Su, Y.; Zhao, Y.; Niu, C.; Liu, R.; Sun, W.; Pei, D. Robust anomaly detection for multivariate time series through stochastic recurrent neural network. In</w:t>
+      <w:bookmarkStart w:id="107" w:name="r-deepsvdd"/>
+      <w:r>
+        <w:rPr>
+          <w:highlight w:val="green"/>
+        </w:rPr>
+        <w:t xml:space="preserve">Ruff, L.; Vandermeulen, R.A.; Görnitz, N.; Deecke, L.; Siddiqui, S.A.; Binder, A.; Müller, E.; Kloft, M. Deep one-class classification. In</w:t>
       </w:r>
       <w:r>
         <w:rPr>
@@ -30710,34 +30791,13 @@
           <w:iCs/>
           <w:highlight w:val="green"/>
         </w:rPr>
-        <w:t xml:space="preserve">Proceedings of the 25th ACM SIGKDD International Conference on Knowledge Discovery &amp; Data Mining (KDD)</w:t>
-      </w:r>
-      <w:r>
-        <w:rPr>
-          <w:highlight w:val="green"/>
-        </w:rPr>
-        <w:t xml:space="preserve">, Anchorage, AK, USA, 4–8 August 2019; pp. 2828–2837.</w:t>
-      </w:r>
-      <w:r>
-        <w:rPr>
-          <w:highlight w:val="green"/>
-        </w:rPr>
-        <w:t xml:space="preserve"> </w:t>
-      </w:r>
-      <w:hyperlink r:id="rId50">
-        <w:r>
-          <w:rPr>
-            <w:rStyle w:val="Hyperlink"/>
-            <w:highlight w:val="green"/>
-          </w:rPr>
-          <w:t xml:space="preserve">https://doi.org/10.1145/3292500.3330672</w:t>
-        </w:r>
-      </w:hyperlink>
-      <w:r>
-        <w:rPr>
-          <w:highlight w:val="green"/>
-        </w:rPr>
-        <w:t xml:space="preserve">.</w:t>
+        <w:t xml:space="preserve">Proceedings of the 35th International Conference on Machine Learning (ICML)</w:t>
+      </w:r>
+      <w:r>
+        <w:rPr>
+          <w:highlight w:val="green"/>
+        </w:rPr>
+        <w:t xml:space="preserve">, Stockholm, Sweden, 10–15 July 2018; PMLR, Vol. 80, pp. 4393–4402.</w:t>
       </w:r>
       <w:bookmarkEnd w:id="107"/>
     </w:p>
@@ -30750,12 +30810,12 @@
         </w:numPr>
         <w:ind w:left="180" w:hanging="180"/>
       </w:pPr>
-      <w:bookmarkStart w:id="109" w:name="r-birihanu"/>
-      <w:r>
-        <w:rPr>
-          <w:highlight w:val="green"/>
-        </w:rPr>
-        <w:t xml:space="preserve">Birihanu, E.; Lendák, I. Explainable correlation-based anomaly detection for industrial control systems.</w:t>
+      <w:bookmarkStart w:id="108" w:name="r-thoc"/>
+      <w:r>
+        <w:rPr>
+          <w:highlight w:val="green"/>
+        </w:rPr>
+        <w:t xml:space="preserve">Shen, L.; Li, Z.; Kwok, J.T. Timeseries anomaly detection using temporal hierarchical one-class network. In</w:t>
       </w:r>
       <w:r>
         <w:rPr>
@@ -30769,70 +30829,15 @@
           <w:iCs/>
           <w:highlight w:val="green"/>
         </w:rPr>
-        <w:t xml:space="preserve">Front. Artif. Intell.</w:t>
-      </w:r>
-      <w:r>
-        <w:rPr>
-          <w:highlight w:val="green"/>
-        </w:rPr>
-        <w:t xml:space="preserve"> </w:t>
-      </w:r>
-      <w:r>
-        <w:rPr>
-          <w:b/>
-          <w:bCs/>
-          <w:highlight w:val="green"/>
-        </w:rPr>
-        <w:t xml:space="preserve">2025</w:t>
-      </w:r>
-      <w:r>
-        <w:rPr>
-          <w:highlight w:val="green"/>
-        </w:rPr>
-        <w:t xml:space="preserve">,</w:t>
-      </w:r>
-      <w:r>
-        <w:rPr>
-          <w:highlight w:val="green"/>
-        </w:rPr>
-        <w:t xml:space="preserve"> </w:t>
-      </w:r>
-      <w:r>
-        <w:rPr>
-          <w:i/>
-          <w:iCs/>
-          <w:highlight w:val="green"/>
-        </w:rPr>
-        <w:t xml:space="preserve">7</w:t>
-      </w:r>
-      <w:r>
-        <w:rPr>
-          <w:highlight w:val="green"/>
-        </w:rPr>
-        <w:t xml:space="preserve">, 1508821.</w:t>
-      </w:r>
-      <w:r>
-        <w:rPr>
-          <w:highlight w:val="green"/>
-        </w:rPr>
-        <w:t xml:space="preserve"> </w:t>
-      </w:r>
-      <w:hyperlink r:id="rId51">
-        <w:r>
-          <w:rPr>
-            <w:rStyle w:val="Hyperlink"/>
-            <w:highlight w:val="green"/>
-          </w:rPr>
-          <w:t xml:space="preserve">https://doi.org/10.3389/frai.2024.1508821</w:t>
-        </w:r>
-      </w:hyperlink>
-      <w:r>
-        <w:rPr>
-          <w:highlight w:val="green"/>
-        </w:rPr>
-        <w:t xml:space="preserve">.</w:t>
-      </w:r>
-      <w:bookmarkEnd w:id="109"/>
+        <w:t xml:space="preserve">Advances in Neural Information Processing Systems 33 (NeurIPS)</w:t>
+      </w:r>
+      <w:r>
+        <w:rPr>
+          <w:highlight w:val="green"/>
+        </w:rPr>
+        <w:t xml:space="preserve">, Online, 6–12 December 2020; pp. 13016–13026.</w:t>
+      </w:r>
+      <w:bookmarkEnd w:id="108"/>
     </w:p>
     <w:p>
       <w:pPr>
@@ -30843,69 +30848,55 @@
         </w:numPr>
         <w:ind w:left="180" w:hanging="180"/>
       </w:pPr>
-      <w:bookmarkStart w:id="111" w:name="r-lw"/>
-      <w:r>
-        <w:rPr/>
-        <w:t xml:space="preserve">Ledoit, O.; Wolf, M. A well-conditioned estimator for large-dimensional covariance matrices.</w:t>
-      </w:r>
-      <w:r>
-        <w:rPr/>
+      <w:bookmarkStart w:id="110" w:name="r-omni"/>
+      <w:r>
+        <w:rPr>
+          <w:highlight w:val="green"/>
+        </w:rPr>
+        <w:t xml:space="preserve">Su, Y.; Zhao, Y.; Niu, C.; Liu, R.; Sun, W.; Pei, D. Robust anomaly detection for multivariate time series through stochastic recurrent neural network. In</w:t>
+      </w:r>
+      <w:r>
+        <w:rPr>
+          <w:highlight w:val="green"/>
+        </w:rPr>
         <w:t xml:space="preserve"> </w:t>
       </w:r>
       <w:r>
         <w:rPr>
           <w:i/>
           <w:iCs/>
-        </w:rPr>
-        <w:t xml:space="preserve">J. Multivar. Anal.</w:t>
-      </w:r>
-      <w:r>
-        <w:rPr/>
-        <w:t xml:space="preserve"> </w:t>
-      </w:r>
-      <w:r>
-        <w:rPr>
-          <w:b/>
-          <w:bCs/>
-        </w:rPr>
-        <w:t xml:space="preserve">2004</w:t>
-      </w:r>
-      <w:r>
-        <w:rPr/>
-        <w:t xml:space="preserve">,</w:t>
-      </w:r>
-      <w:r>
-        <w:rPr/>
-        <w:t xml:space="preserve"> </w:t>
-      </w:r>
-      <w:r>
-        <w:rPr>
-          <w:i/>
-          <w:iCs/>
-        </w:rPr>
-        <w:t xml:space="preserve">88</w:t>
-      </w:r>
-      <w:r>
-        <w:rPr/>
-        <w:t xml:space="preserve">, 365–411.</w:t>
-      </w:r>
-      <w:r>
-        <w:rPr/>
-        <w:t xml:space="preserve"> </w:t>
-      </w:r>
-      <w:hyperlink r:id="rId52">
+          <w:highlight w:val="green"/>
+        </w:rPr>
+        <w:t xml:space="preserve">Proceedings of the 25th ACM SIGKDD International Conference on Knowledge Discovery &amp; Data Mining (KDD)</w:t>
+      </w:r>
+      <w:r>
+        <w:rPr>
+          <w:highlight w:val="green"/>
+        </w:rPr>
+        <w:t xml:space="preserve">, Anchorage, AK, USA, 4–8 August 2019; pp. 2828–2837.</w:t>
+      </w:r>
+      <w:r>
+        <w:rPr>
+          <w:highlight w:val="green"/>
+        </w:rPr>
+        <w:t xml:space="preserve"> </w:t>
+      </w:r>
+      <w:hyperlink r:id="rId51">
         <w:r>
           <w:rPr>
             <w:rStyle w:val="Hyperlink"/>
+            <w:highlight w:val="green"/>
           </w:rPr>
-          <w:t xml:space="preserve">https://doi.org/10.1016/S0047-259X(03)00096-4</w:t>
+          <w:t xml:space="preserve">https://doi.org/10.1145/3292500.3330672</w:t>
         </w:r>
       </w:hyperlink>
       <w:r>
-        <w:rPr/>
+        <w:rPr>
+          <w:highlight w:val="green"/>
+        </w:rPr>
         <w:t xml:space="preserve">.</w:t>
       </w:r>
-      <w:bookmarkEnd w:id="111"/>
+      <w:bookmarkEnd w:id="110"/>
     </w:p>
     <w:p>
       <w:pPr>
@@ -30916,28 +30907,89 @@
         </w:numPr>
         <w:ind w:left="180" w:hanging="180"/>
       </w:pPr>
-      <w:bookmarkStart w:id="113" w:name="r-if"/>
-      <w:r>
-        <w:rPr/>
-        <w:t xml:space="preserve">Liu, F.T.; Ting, K.M.; Zhou, Z.-H. Isolation forest. In Proceedings of the 2008 Eighth IEEE International Conference on Data Mining (ICDM), Pisa, Italy, 15–19 December 2008; pp. 413–422.</w:t>
-      </w:r>
-      <w:r>
-        <w:rPr/>
-        <w:t xml:space="preserve"> </w:t>
-      </w:r>
-      <w:hyperlink r:id="rId53">
+      <w:bookmarkStart w:id="112" w:name="r-birihanu"/>
+      <w:r>
+        <w:rPr>
+          <w:highlight w:val="green"/>
+        </w:rPr>
+        <w:t xml:space="preserve">Birihanu, E.; Lendák, I. Explainable correlation-based anomaly detection for industrial control systems.</w:t>
+      </w:r>
+      <w:r>
+        <w:rPr>
+          <w:highlight w:val="green"/>
+        </w:rPr>
+        <w:t xml:space="preserve"> </w:t>
+      </w:r>
+      <w:r>
+        <w:rPr>
+          <w:i/>
+          <w:iCs/>
+          <w:highlight w:val="green"/>
+        </w:rPr>
+        <w:t xml:space="preserve">Front. Artif. Intell.</w:t>
+      </w:r>
+      <w:r>
+        <w:rPr>
+          <w:highlight w:val="green"/>
+        </w:rPr>
+        <w:t xml:space="preserve"> </w:t>
+      </w:r>
+      <w:r>
+        <w:rPr>
+          <w:b/>
+          <w:bCs/>
+          <w:highlight w:val="green"/>
+        </w:rPr>
+        <w:t xml:space="preserve">2025</w:t>
+      </w:r>
+      <w:r>
+        <w:rPr>
+          <w:highlight w:val="green"/>
+        </w:rPr>
+        <w:t xml:space="preserve">,</w:t>
+      </w:r>
+      <w:r>
+        <w:rPr>
+          <w:highlight w:val="green"/>
+        </w:rPr>
+        <w:t xml:space="preserve"> </w:t>
+      </w:r>
+      <w:r>
+        <w:rPr>
+          <w:i/>
+          <w:iCs/>
+          <w:highlight w:val="green"/>
+        </w:rPr>
+        <w:t xml:space="preserve">7</w:t>
+      </w:r>
+      <w:r>
+        <w:rPr>
+          <w:highlight w:val="green"/>
+        </w:rPr>
+        <w:t xml:space="preserve">, 1508821.</w:t>
+      </w:r>
+      <w:r>
+        <w:rPr>
+          <w:highlight w:val="green"/>
+        </w:rPr>
+        <w:t xml:space="preserve"> </w:t>
+      </w:r>
+      <w:hyperlink r:id="rId52">
         <w:r>
           <w:rPr>
             <w:rStyle w:val="Hyperlink"/>
+            <w:highlight w:val="green"/>
           </w:rPr>
-          <w:t xml:space="preserve">https://doi.org/10.1109/ICDM.2008.17</w:t>
+          <w:t xml:space="preserve">https://doi.org/10.3389/frai.2024.1508821</w:t>
         </w:r>
       </w:hyperlink>
       <w:r>
-        <w:rPr/>
+        <w:rPr>
+          <w:highlight w:val="green"/>
+        </w:rPr>
         <w:t xml:space="preserve">.</w:t>
       </w:r>
-      <w:bookmarkEnd w:id="113"/>
+      <w:bookmarkEnd w:id="112"/>
     </w:p>
     <w:p>
       <w:pPr>
@@ -30948,28 +31000,69 @@
         </w:numPr>
         <w:ind w:left="180" w:hanging="180"/>
       </w:pPr>
-      <w:bookmarkStart w:id="115" w:name="r-aead"/>
-      <w:r>
-        <w:rPr/>
-        <w:t xml:space="preserve">Sakurada, M.; Yairi, T. Anomaly detection using autoencoders with nonlinear dimensionality reduction. In Proceedings of the MLSDA 2014 2nd Workshop on Machine Learning for Sensory Data Analysis, Gold Coast, Australia, 2 December 2014; pp. 4–11.</w:t>
-      </w:r>
-      <w:r>
-        <w:rPr/>
-        <w:t xml:space="preserve"> </w:t>
-      </w:r>
-      <w:hyperlink r:id="rId54">
+      <w:bookmarkStart w:id="114" w:name="r-lw"/>
+      <w:r>
+        <w:rPr/>
+        <w:t xml:space="preserve">Ledoit, O.; Wolf, M. A well-conditioned estimator for large-dimensional covariance matrices.</w:t>
+      </w:r>
+      <w:r>
+        <w:rPr/>
+        <w:t xml:space="preserve"> </w:t>
+      </w:r>
+      <w:r>
+        <w:rPr>
+          <w:i/>
+          <w:iCs/>
+        </w:rPr>
+        <w:t xml:space="preserve">J. Multivar. Anal.</w:t>
+      </w:r>
+      <w:r>
+        <w:rPr/>
+        <w:t xml:space="preserve"> </w:t>
+      </w:r>
+      <w:r>
+        <w:rPr>
+          <w:b/>
+          <w:bCs/>
+        </w:rPr>
+        <w:t xml:space="preserve">2004</w:t>
+      </w:r>
+      <w:r>
+        <w:rPr/>
+        <w:t xml:space="preserve">,</w:t>
+      </w:r>
+      <w:r>
+        <w:rPr/>
+        <w:t xml:space="preserve"> </w:t>
+      </w:r>
+      <w:r>
+        <w:rPr>
+          <w:i/>
+          <w:iCs/>
+        </w:rPr>
+        <w:t xml:space="preserve">88</w:t>
+      </w:r>
+      <w:r>
+        <w:rPr/>
+        <w:t xml:space="preserve">, 365–411.</w:t>
+      </w:r>
+      <w:r>
+        <w:rPr/>
+        <w:t xml:space="preserve"> </w:t>
+      </w:r>
+      <w:hyperlink r:id="rId53">
         <w:r>
           <w:rPr>
             <w:rStyle w:val="Hyperlink"/>
           </w:rPr>
-          <w:t xml:space="preserve">https://doi.org/10.1145/2689746.2689747</w:t>
+          <w:t xml:space="preserve">https://doi.org/10.1016/S0047-259X(03)00096-4</w:t>
         </w:r>
       </w:hyperlink>
       <w:r>
         <w:rPr/>
         <w:t xml:space="preserve">.</w:t>
       </w:r>
-      <w:bookmarkEnd w:id="115"/>
+      <w:bookmarkEnd w:id="114"/>
     </w:p>
     <w:p>
       <w:pPr>
@@ -30980,28 +31073,28 @@
         </w:numPr>
         <w:ind w:left="180" w:hanging="180"/>
       </w:pPr>
-      <w:bookmarkStart w:id="117" w:name="r-usad"/>
-      <w:r>
-        <w:rPr/>
-        <w:t xml:space="preserve">Audibert, J.; Michiardi, P.; Guyard, F.; Marti, S.; Zuluaga, M.A. USAD: Unsupervised anomaly detection on multivariate time series. In Proceedings of the 26th ACM SIGKDD International Conference on Knowledge Discovery &amp; Data Mining (KDD), Virtual Event, CA, USA, 23–27 August 2020; pp. 3395–3404.</w:t>
-      </w:r>
-      <w:r>
-        <w:rPr/>
-        <w:t xml:space="preserve"> </w:t>
-      </w:r>
-      <w:hyperlink r:id="rId55">
+      <w:bookmarkStart w:id="116" w:name="r-if"/>
+      <w:r>
+        <w:rPr/>
+        <w:t xml:space="preserve">Liu, F.T.; Ting, K.M.; Zhou, Z.-H. Isolation forest. In Proceedings of the 2008 Eighth IEEE International Conference on Data Mining (ICDM), Pisa, Italy, 15–19 December 2008; pp. 413–422.</w:t>
+      </w:r>
+      <w:r>
+        <w:rPr/>
+        <w:t xml:space="preserve"> </w:t>
+      </w:r>
+      <w:hyperlink r:id="rId54">
         <w:r>
           <w:rPr>
             <w:rStyle w:val="Hyperlink"/>
           </w:rPr>
-          <w:t xml:space="preserve">https://doi.org/10.1145/3394486.3403392</w:t>
+          <w:t xml:space="preserve">https://doi.org/10.1109/ICDM.2008.17</w:t>
         </w:r>
       </w:hyperlink>
       <w:r>
         <w:rPr/>
         <w:t xml:space="preserve">.</w:t>
       </w:r>
-      <w:bookmarkEnd w:id="117"/>
+      <w:bookmarkEnd w:id="116"/>
     </w:p>
     <w:p>
       <w:pPr>
@@ -31012,69 +31105,28 @@
         </w:numPr>
         <w:ind w:left="180" w:hanging="180"/>
       </w:pPr>
-      <w:bookmarkStart w:id="119" w:name="r-tranad"/>
-      <w:r>
-        <w:rPr/>
-        <w:t xml:space="preserve">Tuli, S.; Casale, G.; Jennings, N.R. TranAD: Deep transformer networks for anomaly detection in multivariate time series data.</w:t>
-      </w:r>
-      <w:r>
-        <w:rPr/>
-        <w:t xml:space="preserve"> </w:t>
-      </w:r>
-      <w:r>
-        <w:rPr>
-          <w:i/>
-          <w:iCs/>
-        </w:rPr>
-        <w:t xml:space="preserve">Proc. VLDB Endow.</w:t>
-      </w:r>
-      <w:r>
-        <w:rPr/>
-        <w:t xml:space="preserve"> </w:t>
-      </w:r>
-      <w:r>
-        <w:rPr>
-          <w:b/>
-          <w:bCs/>
-        </w:rPr>
-        <w:t xml:space="preserve">2022</w:t>
-      </w:r>
-      <w:r>
-        <w:rPr/>
-        <w:t xml:space="preserve">,</w:t>
-      </w:r>
-      <w:r>
-        <w:rPr/>
-        <w:t xml:space="preserve"> </w:t>
-      </w:r>
-      <w:r>
-        <w:rPr>
-          <w:i/>
-          <w:iCs/>
-        </w:rPr>
-        <w:t xml:space="preserve">15</w:t>
-      </w:r>
-      <w:r>
-        <w:rPr/>
-        <w:t xml:space="preserve">, 1201–1214.</w:t>
-      </w:r>
-      <w:r>
-        <w:rPr/>
-        <w:t xml:space="preserve"> </w:t>
-      </w:r>
-      <w:hyperlink r:id="rId56">
+      <w:bookmarkStart w:id="118" w:name="r-aead"/>
+      <w:r>
+        <w:rPr/>
+        <w:t xml:space="preserve">Sakurada, M.; Yairi, T. Anomaly detection using autoencoders with nonlinear dimensionality reduction. In Proceedings of the MLSDA 2014 2nd Workshop on Machine Learning for Sensory Data Analysis, Gold Coast, Australia, 2 December 2014; pp. 4–11.</w:t>
+      </w:r>
+      <w:r>
+        <w:rPr/>
+        <w:t xml:space="preserve"> </w:t>
+      </w:r>
+      <w:hyperlink r:id="rId55">
         <w:r>
           <w:rPr>
             <w:rStyle w:val="Hyperlink"/>
           </w:rPr>
-          <w:t xml:space="preserve">https://doi.org/10.14778/3514061.3514067</w:t>
+          <w:t xml:space="preserve">https://doi.org/10.1145/2689746.2689747</w:t>
         </w:r>
       </w:hyperlink>
       <w:r>
         <w:rPr/>
         <w:t xml:space="preserve">.</w:t>
       </w:r>
-      <w:bookmarkEnd w:id="119"/>
+      <w:bookmarkEnd w:id="118"/>
     </w:p>
     <w:p>
       <w:pPr>
@@ -31085,28 +31137,28 @@
         </w:numPr>
         <w:ind w:left="180" w:hanging="180"/>
       </w:pPr>
-      <w:bookmarkStart w:id="121" w:name="r-gdn"/>
-      <w:r>
-        <w:rPr/>
-        <w:t xml:space="preserve">Deng, A.; Hooi, B. Graph neural network-based anomaly detection in multivariate time series. In Proceedings of the AAAI Conference on Artificial Intelligence, Virtual, 2–9 February 2021; Volume 35, pp. 4027–4035.</w:t>
-      </w:r>
-      <w:r>
-        <w:rPr/>
-        <w:t xml:space="preserve"> </w:t>
-      </w:r>
-      <w:hyperlink r:id="rId57">
+      <w:bookmarkStart w:id="120" w:name="r-usad"/>
+      <w:r>
+        <w:rPr/>
+        <w:t xml:space="preserve">Audibert, J.; Michiardi, P.; Guyard, F.; Marti, S.; Zuluaga, M.A. USAD: Unsupervised anomaly detection on multivariate time series. In Proceedings of the 26th ACM SIGKDD International Conference on Knowledge Discovery &amp; Data Mining (KDD), Virtual Event, CA, USA, 23–27 August 2020; pp. 3395–3404.</w:t>
+      </w:r>
+      <w:r>
+        <w:rPr/>
+        <w:t xml:space="preserve"> </w:t>
+      </w:r>
+      <w:hyperlink r:id="rId56">
         <w:r>
           <w:rPr>
             <w:rStyle w:val="Hyperlink"/>
           </w:rPr>
-          <w:t xml:space="preserve">https://doi.org/10.1609/aaai.v35i5.16523</w:t>
+          <w:t xml:space="preserve">https://doi.org/10.1145/3394486.3403392</w:t>
         </w:r>
       </w:hyperlink>
       <w:r>
         <w:rPr/>
         <w:t xml:space="preserve">.</w:t>
       </w:r>
-      <w:bookmarkEnd w:id="121"/>
+      <w:bookmarkEnd w:id="120"/>
     </w:p>
     <w:p>
       <w:pPr>
@@ -31117,55 +31169,69 @@
         </w:numPr>
         <w:ind w:left="180" w:hanging="180"/>
       </w:pPr>
-      <w:bookmarkStart w:id="123" w:name="r-graphmoe"/>
-      <w:r>
-        <w:rPr>
-          <w:highlight w:val="green"/>
-        </w:rPr>
-        <w:t xml:space="preserve">Huang, X.; Chen, W.; Hu, B.; Mao, Z. Graph mixture of experts and memory-augmented routers for multivariate time series anomaly detection. In</w:t>
-      </w:r>
-      <w:r>
-        <w:rPr>
-          <w:highlight w:val="green"/>
-        </w:rPr>
+      <w:bookmarkStart w:id="122" w:name="r-tranad"/>
+      <w:r>
+        <w:rPr/>
+        <w:t xml:space="preserve">Tuli, S.; Casale, G.; Jennings, N.R. TranAD: Deep transformer networks for anomaly detection in multivariate time series data.</w:t>
+      </w:r>
+      <w:r>
+        <w:rPr/>
         <w:t xml:space="preserve"> </w:t>
       </w:r>
       <w:r>
         <w:rPr>
           <w:i/>
           <w:iCs/>
-          <w:highlight w:val="green"/>
-        </w:rPr>
-        <w:t xml:space="preserve">Proceedings of the AAAI Conference on Artificial Intelligence</w:t>
-      </w:r>
-      <w:r>
-        <w:rPr>
-          <w:highlight w:val="green"/>
-        </w:rPr>
-        <w:t xml:space="preserve">, Philadelphia, PA, USA, 25 February–4 March 2025; Volume 39, pp. 17476–17484.</w:t>
-      </w:r>
-      <w:r>
-        <w:rPr>
-          <w:highlight w:val="green"/>
-        </w:rPr>
-        <w:t xml:space="preserve"> </w:t>
-      </w:r>
-      <w:hyperlink r:id="rId58">
+        </w:rPr>
+        <w:t xml:space="preserve">Proc. VLDB Endow.</w:t>
+      </w:r>
+      <w:r>
+        <w:rPr/>
+        <w:t xml:space="preserve"> </w:t>
+      </w:r>
+      <w:r>
+        <w:rPr>
+          <w:b/>
+          <w:bCs/>
+        </w:rPr>
+        <w:t xml:space="preserve">2022</w:t>
+      </w:r>
+      <w:r>
+        <w:rPr/>
+        <w:t xml:space="preserve">,</w:t>
+      </w:r>
+      <w:r>
+        <w:rPr/>
+        <w:t xml:space="preserve"> </w:t>
+      </w:r>
+      <w:r>
+        <w:rPr>
+          <w:i/>
+          <w:iCs/>
+        </w:rPr>
+        <w:t xml:space="preserve">15</w:t>
+      </w:r>
+      <w:r>
+        <w:rPr/>
+        <w:t xml:space="preserve">, 1201–1214.</w:t>
+      </w:r>
+      <w:r>
+        <w:rPr/>
+        <w:t xml:space="preserve"> </w:t>
+      </w:r>
+      <w:hyperlink r:id="rId57">
         <w:r>
           <w:rPr>
             <w:rStyle w:val="Hyperlink"/>
-            <w:highlight w:val="green"/>
           </w:rPr>
-          <w:t xml:space="preserve">https://doi.org/10.1609/aaai.v39i16.33921</w:t>
+          <w:t xml:space="preserve">https://doi.org/10.14778/3514061.3514067</w:t>
         </w:r>
       </w:hyperlink>
       <w:r>
-        <w:rPr>
-          <w:highlight w:val="green"/>
-        </w:rPr>
+        <w:rPr/>
         <w:t xml:space="preserve">.</w:t>
       </w:r>
-      <w:bookmarkEnd w:id="123"/>
+      <w:bookmarkEnd w:id="122"/>
     </w:p>
     <w:p>
       <w:pPr>
@@ -31176,28 +31242,28 @@
         </w:numPr>
         <w:ind w:left="180" w:hanging="180"/>
       </w:pPr>
-      <w:bookmarkStart w:id="125" w:name="r-sensitivehue"/>
-      <w:r>
-        <w:rPr/>
-        <w:t xml:space="preserve">Feng, Y.; Zhang, W.; Fu, Y.; Jiang, W.; Zhu, J.; Ren, W. SensitiveHUE: Multivariate time series anomaly detection by enhancing the sensitivity to normal patterns. In Proceedings of the 30th ACM SIGKDD Conference on Knowledge Discovery and Data Mining (KDD), Barcelona, Spain, 25–29 August 2024; pp. 782–793.</w:t>
-      </w:r>
-      <w:r>
-        <w:rPr/>
-        <w:t xml:space="preserve"> </w:t>
-      </w:r>
-      <w:hyperlink r:id="rId59">
+      <w:bookmarkStart w:id="124" w:name="r-gdn"/>
+      <w:r>
+        <w:rPr/>
+        <w:t xml:space="preserve">Deng, A.; Hooi, B. Graph neural network-based anomaly detection in multivariate time series. In Proceedings of the AAAI Conference on Artificial Intelligence, Virtual, 2–9 February 2021; Volume 35, pp. 4027–4035.</w:t>
+      </w:r>
+      <w:r>
+        <w:rPr/>
+        <w:t xml:space="preserve"> </w:t>
+      </w:r>
+      <w:hyperlink r:id="rId58">
         <w:r>
           <w:rPr>
             <w:rStyle w:val="Hyperlink"/>
           </w:rPr>
-          <w:t xml:space="preserve">https://doi.org/10.1145/3637528.3671919</w:t>
+          <w:t xml:space="preserve">https://doi.org/10.1609/aaai.v35i5.16523</w:t>
         </w:r>
       </w:hyperlink>
       <w:r>
         <w:rPr/>
         <w:t xml:space="preserve">.</w:t>
       </w:r>
-      <w:bookmarkEnd w:id="125"/>
+      <w:bookmarkEnd w:id="124"/>
     </w:p>
     <w:p>
       <w:pPr>
@@ -31208,28 +31274,55 @@
         </w:numPr>
         <w:ind w:left="180" w:hanging="180"/>
       </w:pPr>
-      <w:bookmarkStart w:id="127" w:name="r-catch"/>
-      <w:r>
-        <w:rPr/>
-        <w:t xml:space="preserve">Wu, X.; Qiu, X.; Li, Z.; Hu, Y.; Guo, C.; Xu, X.; Yang, B. CATCH: Channel-aware multivariate time series anomaly detection via frequency patching. In Proceedings of the International Conference on Learning Representations (ICLR), Singapore, 24–28 April 2025.</w:t>
-      </w:r>
-      <w:r>
-        <w:rPr/>
-        <w:t xml:space="preserve"> </w:t>
-      </w:r>
-      <w:hyperlink r:id="rId60">
+      <w:bookmarkStart w:id="126" w:name="r-graphmoe"/>
+      <w:r>
+        <w:rPr>
+          <w:highlight w:val="green"/>
+        </w:rPr>
+        <w:t xml:space="preserve">Huang, X.; Chen, W.; Hu, B.; Mao, Z. Graph mixture of experts and memory-augmented routers for multivariate time series anomaly detection. In</w:t>
+      </w:r>
+      <w:r>
+        <w:rPr>
+          <w:highlight w:val="green"/>
+        </w:rPr>
+        <w:t xml:space="preserve"> </w:t>
+      </w:r>
+      <w:r>
+        <w:rPr>
+          <w:i/>
+          <w:iCs/>
+          <w:highlight w:val="green"/>
+        </w:rPr>
+        <w:t xml:space="preserve">Proceedings of the AAAI Conference on Artificial Intelligence</w:t>
+      </w:r>
+      <w:r>
+        <w:rPr>
+          <w:highlight w:val="green"/>
+        </w:rPr>
+        <w:t xml:space="preserve">, Philadelphia, PA, USA, 25 February–4 March 2025; Volume 39, pp. 17476–17484.</w:t>
+      </w:r>
+      <w:r>
+        <w:rPr>
+          <w:highlight w:val="green"/>
+        </w:rPr>
+        <w:t xml:space="preserve"> </w:t>
+      </w:r>
+      <w:hyperlink r:id="rId59">
         <w:r>
           <w:rPr>
             <w:rStyle w:val="Hyperlink"/>
+            <w:highlight w:val="green"/>
           </w:rPr>
-          <w:t xml:space="preserve">arXiv:2410.12261</w:t>
+          <w:t xml:space="preserve">https://doi.org/10.1609/aaai.v39i16.33921</w:t>
         </w:r>
       </w:hyperlink>
       <w:r>
-        <w:rPr/>
+        <w:rPr>
+          <w:highlight w:val="green"/>
+        </w:rPr>
         <w:t xml:space="preserve">.</w:t>
       </w:r>
-      <w:bookmarkEnd w:id="127"/>
+      <w:bookmarkEnd w:id="126"/>
     </w:p>
     <w:p>
       <w:pPr>
@@ -31240,28 +31333,28 @@
         </w:numPr>
         <w:ind w:left="180" w:hanging="180"/>
       </w:pPr>
-      <w:bookmarkStart w:id="129" w:name="r-gearbox"/>
-      <w:r>
-        <w:rPr/>
-        <w:t xml:space="preserve">Gildish, E.; Grebshtein, M.; Aperstein, Y.; Makienko, I. Vibration-based estimation of gearbox operating conditions: Machine learning approach. In Proceedings of the 2023 International Conference on Control, Automation and Diagnosis (ICCAD), Rome, Italy, 10–12 May 2023; pp. 1–6.</w:t>
-      </w:r>
-      <w:r>
-        <w:rPr/>
-        <w:t xml:space="preserve"> </w:t>
-      </w:r>
-      <w:hyperlink r:id="rId61">
+      <w:bookmarkStart w:id="128" w:name="r-sensitivehue"/>
+      <w:r>
+        <w:rPr/>
+        <w:t xml:space="preserve">Feng, Y.; Zhang, W.; Fu, Y.; Jiang, W.; Zhu, J.; Ren, W. SensitiveHUE: Multivariate time series anomaly detection by enhancing the sensitivity to normal patterns. In Proceedings of the 30th ACM SIGKDD Conference on Knowledge Discovery and Data Mining (KDD), Barcelona, Spain, 25–29 August 2024; pp. 782–793.</w:t>
+      </w:r>
+      <w:r>
+        <w:rPr/>
+        <w:t xml:space="preserve"> </w:t>
+      </w:r>
+      <w:hyperlink r:id="rId60">
         <w:r>
           <w:rPr>
             <w:rStyle w:val="Hyperlink"/>
           </w:rPr>
-          <w:t xml:space="preserve">https://doi.org/10.1109/ICCAD57653.2023.10152303</w:t>
+          <w:t xml:space="preserve">https://doi.org/10.1145/3637528.3671919</w:t>
         </w:r>
       </w:hyperlink>
       <w:r>
         <w:rPr/>
         <w:t xml:space="preserve">.</w:t>
       </w:r>
-      <w:bookmarkEnd w:id="129"/>
+      <w:bookmarkEnd w:id="128"/>
     </w:p>
     <w:p>
       <w:pPr>
@@ -31272,69 +31365,28 @@
         </w:numPr>
         <w:ind w:left="180" w:hanging="180"/>
       </w:pPr>
-      <w:bookmarkStart w:id="131" w:name="r-vibdecomp"/>
-      <w:r>
-        <w:rPr/>
-        <w:t xml:space="preserve">Gildish, E.; Grebshtein, M.; Aperstein, Y.; Makienko, I. Vibration signal decomposition using dilated CNN.</w:t>
-      </w:r>
-      <w:r>
-        <w:rPr/>
-        <w:t xml:space="preserve"> </w:t>
-      </w:r>
-      <w:r>
-        <w:rPr>
-          <w:i/>
-          <w:iCs/>
-        </w:rPr>
-        <w:t xml:space="preserve">Proc. Annu. Conf. PHM Soc.</w:t>
-      </w:r>
-      <w:r>
-        <w:rPr/>
-        <w:t xml:space="preserve"> </w:t>
-      </w:r>
-      <w:r>
-        <w:rPr>
-          <w:b/>
-          <w:bCs/>
-        </w:rPr>
-        <w:t xml:space="preserve">2023</w:t>
-      </w:r>
-      <w:r>
-        <w:rPr/>
-        <w:t xml:space="preserve">,</w:t>
-      </w:r>
-      <w:r>
-        <w:rPr/>
-        <w:t xml:space="preserve"> </w:t>
-      </w:r>
-      <w:r>
-        <w:rPr>
-          <w:i/>
-          <w:iCs/>
-        </w:rPr>
-        <w:t xml:space="preserve">15</w:t>
-      </w:r>
-      <w:r>
-        <w:rPr/>
-        <w:t xml:space="preserve">.</w:t>
-      </w:r>
-      <w:r>
-        <w:rPr/>
-        <w:t xml:space="preserve"> </w:t>
-      </w:r>
-      <w:hyperlink r:id="rId62">
+      <w:bookmarkStart w:id="130" w:name="r-catch"/>
+      <w:r>
+        <w:rPr/>
+        <w:t xml:space="preserve">Wu, X.; Qiu, X.; Li, Z.; Hu, Y.; Guo, C.; Xu, X.; Yang, B. CATCH: Channel-aware multivariate time series anomaly detection via frequency patching. In Proceedings of the International Conference on Learning Representations (ICLR), Singapore, 24–28 April 2025.</w:t>
+      </w:r>
+      <w:r>
+        <w:rPr/>
+        <w:t xml:space="preserve"> </w:t>
+      </w:r>
+      <w:hyperlink r:id="rId61">
         <w:r>
           <w:rPr>
             <w:rStyle w:val="Hyperlink"/>
           </w:rPr>
-          <w:t xml:space="preserve">https://doi.org/10.36001/phmconf.2023.v15i1.3502</w:t>
+          <w:t xml:space="preserve">arXiv:2410.12261</w:t>
         </w:r>
       </w:hyperlink>
       <w:r>
         <w:rPr/>
         <w:t xml:space="preserve">.</w:t>
       </w:r>
-      <w:bookmarkEnd w:id="131"/>
+      <w:bookmarkEnd w:id="130"/>
     </w:p>
     <w:p>
       <w:pPr>
@@ -31345,69 +31397,28 @@
         </w:numPr>
         <w:ind w:left="180" w:hanging="180"/>
       </w:pPr>
-      <w:bookmarkStart w:id="133" w:name="r-bolt"/>
-      <w:r>
-        <w:rPr/>
-        <w:t xml:space="preserve">Gildish, E.; Grebshtein, M.; Aperstein, Y.; Kushnirski, A.; Makienko, I. Helicopter bolt loosening monitoring using vibrations and machine learning.</w:t>
-      </w:r>
-      <w:r>
-        <w:rPr/>
-        <w:t xml:space="preserve"> </w:t>
-      </w:r>
-      <w:r>
-        <w:rPr>
-          <w:i/>
-          <w:iCs/>
-        </w:rPr>
-        <w:t xml:space="preserve">PHM Soc. Eur. Conf.</w:t>
-      </w:r>
-      <w:r>
-        <w:rPr/>
-        <w:t xml:space="preserve"> </w:t>
-      </w:r>
-      <w:r>
-        <w:rPr>
-          <w:b/>
-          <w:bCs/>
-        </w:rPr>
-        <w:t xml:space="preserve">2022</w:t>
-      </w:r>
-      <w:r>
-        <w:rPr/>
-        <w:t xml:space="preserve">,</w:t>
-      </w:r>
-      <w:r>
-        <w:rPr/>
-        <w:t xml:space="preserve"> </w:t>
-      </w:r>
-      <w:r>
-        <w:rPr>
-          <w:i/>
-          <w:iCs/>
-        </w:rPr>
-        <w:t xml:space="preserve">7</w:t>
-      </w:r>
-      <w:r>
-        <w:rPr/>
-        <w:t xml:space="preserve">, 146–155.</w:t>
-      </w:r>
-      <w:r>
-        <w:rPr/>
-        <w:t xml:space="preserve"> </w:t>
-      </w:r>
-      <w:hyperlink r:id="rId63">
+      <w:bookmarkStart w:id="132" w:name="r-gearbox"/>
+      <w:r>
+        <w:rPr/>
+        <w:t xml:space="preserve">Gildish, E.; Grebshtein, M.; Aperstein, Y.; Makienko, I. Vibration-based estimation of gearbox operating conditions: Machine learning approach. In Proceedings of the 2023 International Conference on Control, Automation and Diagnosis (ICCAD), Rome, Italy, 10–12 May 2023; pp. 1–6.</w:t>
+      </w:r>
+      <w:r>
+        <w:rPr/>
+        <w:t xml:space="preserve"> </w:t>
+      </w:r>
+      <w:hyperlink r:id="rId62">
         <w:r>
           <w:rPr>
             <w:rStyle w:val="Hyperlink"/>
           </w:rPr>
-          <w:t xml:space="preserve">https://doi.org/10.36001/phme.2022.v7i1.3322</w:t>
+          <w:t xml:space="preserve">https://doi.org/10.1109/ICCAD57653.2023.10152303</w:t>
         </w:r>
       </w:hyperlink>
       <w:r>
         <w:rPr/>
         <w:t xml:space="preserve">.</w:t>
       </w:r>
-      <w:bookmarkEnd w:id="133"/>
+      <w:bookmarkEnd w:id="132"/>
     </w:p>
     <w:p>
       <w:pPr>
@@ -31418,10 +31429,10 @@
         </w:numPr>
         <w:ind w:left="180" w:hanging="180"/>
       </w:pPr>
-      <w:bookmarkStart w:id="135" w:name="r-rotorcraft"/>
-      <w:r>
-        <w:rPr/>
-        <w:t xml:space="preserve">Shavit, D.; Davidovits, M.; Kushnirsky, A.; Aperstein, Y. Temporal causality-based feature selection for fault prediction in rotorcraft flight controls.</w:t>
+      <w:bookmarkStart w:id="134" w:name="r-vibdecomp"/>
+      <w:r>
+        <w:rPr/>
+        <w:t xml:space="preserve">Gildish, E.; Grebshtein, M.; Aperstein, Y.; Makienko, I. Vibration signal decomposition using dilated CNN.</w:t>
       </w:r>
       <w:r>
         <w:rPr/>
@@ -31432,7 +31443,7 @@
           <w:i/>
           <w:iCs/>
         </w:rPr>
-        <w:t xml:space="preserve">IFAC-PapersOnLine</w:t>
+        <w:t xml:space="preserve">Proc. Annu. Conf. PHM Soc.</w:t>
       </w:r>
       <w:r>
         <w:rPr/>
@@ -31443,7 +31454,7 @@
           <w:b/>
           <w:bCs/>
         </w:rPr>
-        <w:t xml:space="preserve">2022</w:t>
+        <w:t xml:space="preserve">2023</w:t>
       </w:r>
       <w:r>
         <w:rPr/>
@@ -31458,29 +31469,29 @@
           <w:i/>
           <w:iCs/>
         </w:rPr>
-        <w:t xml:space="preserve">55</w:t>
-      </w:r>
-      <w:r>
-        <w:rPr/>
-        <w:t xml:space="preserve">, 235–239.</w:t>
-      </w:r>
-      <w:r>
-        <w:rPr/>
-        <w:t xml:space="preserve"> </w:t>
-      </w:r>
-      <w:hyperlink r:id="rId64">
+        <w:t xml:space="preserve">15</w:t>
+      </w:r>
+      <w:r>
+        <w:rPr/>
+        <w:t xml:space="preserve">.</w:t>
+      </w:r>
+      <w:r>
+        <w:rPr/>
+        <w:t xml:space="preserve"> </w:t>
+      </w:r>
+      <w:hyperlink r:id="rId63">
         <w:r>
           <w:rPr>
             <w:rStyle w:val="Hyperlink"/>
           </w:rPr>
-          <w:t xml:space="preserve">https://doi.org/10.1016/j.ifacol.2022.04.199</w:t>
+          <w:t xml:space="preserve">https://doi.org/10.36001/phmconf.2023.v15i1.3502</w:t>
         </w:r>
       </w:hyperlink>
       <w:r>
         <w:rPr/>
         <w:t xml:space="preserve">.</w:t>
       </w:r>
-      <w:bookmarkEnd w:id="135"/>
+      <w:bookmarkEnd w:id="134"/>
     </w:p>
     <w:p>
       <w:pPr>
@@ -31491,89 +31502,69 @@
         </w:numPr>
         <w:ind w:left="180" w:hanging="180"/>
       </w:pPr>
-      <w:bookmarkStart w:id="137" w:name="r-batadal"/>
-      <w:r>
-        <w:rPr>
-          <w:highlight w:val="green"/>
-        </w:rPr>
-        <w:t xml:space="preserve">Taormina, R.; Galelli, S.; Tippenhauer, N.O.; Salomons, E.; Ostfeld, A.; Eliades, D.G.; Aghashahi, M.; Sundararajan, R.; Pourahmadi, M.; Banks, M.K.; et al. Battle of the attack detection algorithms: Disclosing cyber attacks on water distribution networks.</w:t>
-      </w:r>
-      <w:r>
-        <w:rPr>
-          <w:highlight w:val="green"/>
-        </w:rPr>
+      <w:bookmarkStart w:id="136" w:name="r-bolt"/>
+      <w:r>
+        <w:rPr/>
+        <w:t xml:space="preserve">Gildish, E.; Grebshtein, M.; Aperstein, Y.; Kushnirski, A.; Makienko, I. Helicopter bolt loosening monitoring using vibrations and machine learning.</w:t>
+      </w:r>
+      <w:r>
+        <w:rPr/>
         <w:t xml:space="preserve"> </w:t>
       </w:r>
       <w:r>
         <w:rPr>
           <w:i/>
           <w:iCs/>
-          <w:highlight w:val="green"/>
-        </w:rPr>
-        <w:t xml:space="preserve">J. Water Resour. Plan. Manag.</w:t>
-      </w:r>
-      <w:r>
-        <w:rPr>
-          <w:highlight w:val="green"/>
-        </w:rPr>
+        </w:rPr>
+        <w:t xml:space="preserve">PHM Soc. Eur. Conf.</w:t>
+      </w:r>
+      <w:r>
+        <w:rPr/>
         <w:t xml:space="preserve"> </w:t>
       </w:r>
       <w:r>
         <w:rPr>
           <w:b/>
           <w:bCs/>
-          <w:highlight w:val="green"/>
-        </w:rPr>
-        <w:t xml:space="preserve">2018</w:t>
-      </w:r>
-      <w:r>
-        <w:rPr>
-          <w:highlight w:val="green"/>
-        </w:rPr>
+        </w:rPr>
+        <w:t xml:space="preserve">2022</w:t>
+      </w:r>
+      <w:r>
+        <w:rPr/>
         <w:t xml:space="preserve">,</w:t>
       </w:r>
       <w:r>
-        <w:rPr>
-          <w:highlight w:val="green"/>
-        </w:rPr>
+        <w:rPr/>
         <w:t xml:space="preserve"> </w:t>
       </w:r>
       <w:r>
         <w:rPr>
           <w:i/>
           <w:iCs/>
-          <w:highlight w:val="green"/>
-        </w:rPr>
-        <w:t xml:space="preserve">144</w:t>
-      </w:r>
-      <w:r>
-        <w:rPr>
-          <w:highlight w:val="green"/>
-        </w:rPr>
-        <w:t xml:space="preserve">, 04018048.</w:t>
-      </w:r>
-      <w:r>
-        <w:rPr>
-          <w:highlight w:val="green"/>
-        </w:rPr>
-        <w:t xml:space="preserve"> </w:t>
-      </w:r>
-      <w:hyperlink r:id="rId65">
+        </w:rPr>
+        <w:t xml:space="preserve">7</w:t>
+      </w:r>
+      <w:r>
+        <w:rPr/>
+        <w:t xml:space="preserve">, 146–155.</w:t>
+      </w:r>
+      <w:r>
+        <w:rPr/>
+        <w:t xml:space="preserve"> </w:t>
+      </w:r>
+      <w:hyperlink r:id="rId64">
         <w:r>
           <w:rPr>
             <w:rStyle w:val="Hyperlink"/>
-            <w:highlight w:val="green"/>
           </w:rPr>
-          <w:t xml:space="preserve">https://doi.org/10.1061/(ASCE)WR.1943-5452.0000969</w:t>
+          <w:t xml:space="preserve">https://doi.org/10.36001/phme.2022.v7i1.3322</w:t>
         </w:r>
       </w:hyperlink>
       <w:r>
-        <w:rPr>
-          <w:highlight w:val="green"/>
-        </w:rPr>
+        <w:rPr/>
         <w:t xml:space="preserve">.</w:t>
       </w:r>
-      <w:bookmarkEnd w:id="137"/>
+      <w:bookmarkEnd w:id="136"/>
     </w:p>
     <w:p>
       <w:pPr>
@@ -31584,89 +31575,69 @@
         </w:numPr>
         <w:ind w:left="180" w:hanging="180"/>
       </w:pPr>
-      <w:bookmarkStart w:id="139" w:name="r-ncmapss"/>
-      <w:r>
-        <w:rPr>
-          <w:highlight w:val="green"/>
-        </w:rPr>
-        <w:t xml:space="preserve">Arias Chao, M.; Kulkarni, C.; Goebel, K.; Fink, O. Aircraft engine run-to-failure dataset under real flight conditions for prognostics and diagnostics.</w:t>
-      </w:r>
-      <w:r>
-        <w:rPr>
-          <w:highlight w:val="green"/>
-        </w:rPr>
+      <w:bookmarkStart w:id="138" w:name="r-rotorcraft"/>
+      <w:r>
+        <w:rPr/>
+        <w:t xml:space="preserve">Shavit, D.; Davidovits, M.; Kushnirsky, A.; Aperstein, Y. Temporal causality-based feature selection for fault prediction in rotorcraft flight controls.</w:t>
+      </w:r>
+      <w:r>
+        <w:rPr/>
         <w:t xml:space="preserve"> </w:t>
       </w:r>
       <w:r>
         <w:rPr>
           <w:i/>
           <w:iCs/>
-          <w:highlight w:val="green"/>
-        </w:rPr>
-        <w:t xml:space="preserve">Data</w:t>
-      </w:r>
-      <w:r>
-        <w:rPr>
-          <w:highlight w:val="green"/>
-        </w:rPr>
+        </w:rPr>
+        <w:t xml:space="preserve">IFAC-PapersOnLine</w:t>
+      </w:r>
+      <w:r>
+        <w:rPr/>
         <w:t xml:space="preserve"> </w:t>
       </w:r>
       <w:r>
         <w:rPr>
           <w:b/>
           <w:bCs/>
-          <w:highlight w:val="green"/>
-        </w:rPr>
-        <w:t xml:space="preserve">2021</w:t>
-      </w:r>
-      <w:r>
-        <w:rPr>
-          <w:highlight w:val="green"/>
-        </w:rPr>
+        </w:rPr>
+        <w:t xml:space="preserve">2022</w:t>
+      </w:r>
+      <w:r>
+        <w:rPr/>
         <w:t xml:space="preserve">,</w:t>
       </w:r>
       <w:r>
-        <w:rPr>
-          <w:highlight w:val="green"/>
-        </w:rPr>
+        <w:rPr/>
         <w:t xml:space="preserve"> </w:t>
       </w:r>
       <w:r>
         <w:rPr>
           <w:i/>
           <w:iCs/>
-          <w:highlight w:val="green"/>
-        </w:rPr>
-        <w:t xml:space="preserve">6</w:t>
-      </w:r>
-      <w:r>
-        <w:rPr>
-          <w:highlight w:val="green"/>
-        </w:rPr>
-        <w:t xml:space="preserve">, 5.</w:t>
-      </w:r>
-      <w:r>
-        <w:rPr>
-          <w:highlight w:val="green"/>
-        </w:rPr>
-        <w:t xml:space="preserve"> </w:t>
-      </w:r>
-      <w:hyperlink r:id="rId66">
+        </w:rPr>
+        <w:t xml:space="preserve">55</w:t>
+      </w:r>
+      <w:r>
+        <w:rPr/>
+        <w:t xml:space="preserve">, 235–239.</w:t>
+      </w:r>
+      <w:r>
+        <w:rPr/>
+        <w:t xml:space="preserve"> </w:t>
+      </w:r>
+      <w:hyperlink r:id="rId65">
         <w:r>
           <w:rPr>
             <w:rStyle w:val="Hyperlink"/>
-            <w:highlight w:val="green"/>
           </w:rPr>
-          <w:t xml:space="preserve">https://doi.org/10.3390/data6010005</w:t>
+          <w:t xml:space="preserve">https://doi.org/10.1016/j.ifacol.2022.04.199</w:t>
         </w:r>
       </w:hyperlink>
       <w:r>
-        <w:rPr>
-          <w:highlight w:val="green"/>
-        </w:rPr>
+        <w:rPr/>
         <w:t xml:space="preserve">.</w:t>
       </w:r>
-      <w:bookmarkEnd w:id="139"/>
+      <w:bookmarkEnd w:id="138"/>
     </w:p>
     <w:p>
       <w:pPr>
@@ -31677,12 +31648,12 @@
         </w:numPr>
         <w:ind w:left="180" w:hanging="180"/>
       </w:pPr>
-      <w:bookmarkStart w:id="141" w:name="r-tsbuad"/>
-      <w:r>
-        <w:rPr>
-          <w:highlight w:val="green"/>
-        </w:rPr>
-        <w:t xml:space="preserve">Paparrizos, J.; Kang, Y.; Boniol, P.; Tsay, R.S.; Palpanas, T.; Franklin, M.J. TSB-UAD: An end-to-end benchmark suite for univariate time-series anomaly detection.</w:t>
+      <w:bookmarkStart w:id="140" w:name="r-batadal"/>
+      <w:r>
+        <w:rPr>
+          <w:highlight w:val="green"/>
+        </w:rPr>
+        <w:t xml:space="preserve">Taormina, R.; Galelli, S.; Tippenhauer, N.O.; Salomons, E.; Ostfeld, A.; Eliades, D.G.; Aghashahi, M.; Sundararajan, R.; Pourahmadi, M.; Banks, M.K.; et al. Battle of the attack detection algorithms: Disclosing cyber attacks on water distribution networks.</w:t>
       </w:r>
       <w:r>
         <w:rPr>
@@ -31696,7 +31667,7 @@
           <w:iCs/>
           <w:highlight w:val="green"/>
         </w:rPr>
-        <w:t xml:space="preserve">Proc. VLDB Endow.</w:t>
+        <w:t xml:space="preserve">J. Water Resour. Plan. Manag.</w:t>
       </w:r>
       <w:r>
         <w:rPr>
@@ -31710,7 +31681,7 @@
           <w:bCs/>
           <w:highlight w:val="green"/>
         </w:rPr>
-        <w:t xml:space="preserve">2022</w:t>
+        <w:t xml:space="preserve">2018</w:t>
       </w:r>
       <w:r>
         <w:rPr>
@@ -31730,27 +31701,27 @@
           <w:iCs/>
           <w:highlight w:val="green"/>
         </w:rPr>
-        <w:t xml:space="preserve">15</w:t>
-      </w:r>
-      <w:r>
-        <w:rPr>
-          <w:highlight w:val="green"/>
-        </w:rPr>
-        <w:t xml:space="preserve">, 1697–1711.</w:t>
-      </w:r>
-      <w:r>
-        <w:rPr>
-          <w:highlight w:val="green"/>
-        </w:rPr>
-        <w:t xml:space="preserve"> </w:t>
-      </w:r>
-      <w:hyperlink r:id="rId67">
+        <w:t xml:space="preserve">144</w:t>
+      </w:r>
+      <w:r>
+        <w:rPr>
+          <w:highlight w:val="green"/>
+        </w:rPr>
+        <w:t xml:space="preserve">, 04018048.</w:t>
+      </w:r>
+      <w:r>
+        <w:rPr>
+          <w:highlight w:val="green"/>
+        </w:rPr>
+        <w:t xml:space="preserve"> </w:t>
+      </w:r>
+      <w:hyperlink r:id="rId66">
         <w:r>
           <w:rPr>
             <w:rStyle w:val="Hyperlink"/>
             <w:highlight w:val="green"/>
           </w:rPr>
-          <w:t xml:space="preserve">https://doi.org/10.14778/3529337.3529354</w:t>
+          <w:t xml:space="preserve">https://doi.org/10.1061/(ASCE)WR.1943-5452.0000969</w:t>
         </w:r>
       </w:hyperlink>
       <w:r>
@@ -31759,7 +31730,7 @@
         </w:rPr>
         <w:t xml:space="preserve">.</w:t>
       </w:r>
-      <w:bookmarkEnd w:id="141"/>
+      <w:bookmarkEnd w:id="140"/>
     </w:p>
     <w:p>
       <w:pPr>
@@ -31770,69 +31741,89 @@
         </w:numPr>
         <w:ind w:left="180" w:hanging="180"/>
       </w:pPr>
-      <w:bookmarkStart w:id="143" w:name="r-hc"/>
-      <w:r>
-        <w:rPr/>
-        <w:t xml:space="preserve">Donoho, D.; Jin, J. Higher criticism for detecting sparse heterogeneous mixtures.</w:t>
-      </w:r>
-      <w:r>
-        <w:rPr/>
+      <w:bookmarkStart w:id="142" w:name="r-ncmapss"/>
+      <w:r>
+        <w:rPr>
+          <w:highlight w:val="green"/>
+        </w:rPr>
+        <w:t xml:space="preserve">Arias Chao, M.; Kulkarni, C.; Goebel, K.; Fink, O. Aircraft engine run-to-failure dataset under real flight conditions for prognostics and diagnostics.</w:t>
+      </w:r>
+      <w:r>
+        <w:rPr>
+          <w:highlight w:val="green"/>
+        </w:rPr>
         <w:t xml:space="preserve"> </w:t>
       </w:r>
       <w:r>
         <w:rPr>
           <w:i/>
           <w:iCs/>
-        </w:rPr>
-        <w:t xml:space="preserve">Ann. Stat.</w:t>
-      </w:r>
-      <w:r>
-        <w:rPr/>
+          <w:highlight w:val="green"/>
+        </w:rPr>
+        <w:t xml:space="preserve">Data</w:t>
+      </w:r>
+      <w:r>
+        <w:rPr>
+          <w:highlight w:val="green"/>
+        </w:rPr>
         <w:t xml:space="preserve"> </w:t>
       </w:r>
       <w:r>
         <w:rPr>
           <w:b/>
           <w:bCs/>
-        </w:rPr>
-        <w:t xml:space="preserve">2004</w:t>
-      </w:r>
-      <w:r>
-        <w:rPr/>
+          <w:highlight w:val="green"/>
+        </w:rPr>
+        <w:t xml:space="preserve">2021</w:t>
+      </w:r>
+      <w:r>
+        <w:rPr>
+          <w:highlight w:val="green"/>
+        </w:rPr>
         <w:t xml:space="preserve">,</w:t>
       </w:r>
       <w:r>
-        <w:rPr/>
+        <w:rPr>
+          <w:highlight w:val="green"/>
+        </w:rPr>
         <w:t xml:space="preserve"> </w:t>
       </w:r>
       <w:r>
         <w:rPr>
           <w:i/>
           <w:iCs/>
-        </w:rPr>
-        <w:t xml:space="preserve">32</w:t>
-      </w:r>
-      <w:r>
-        <w:rPr/>
-        <w:t xml:space="preserve">, 962–994.</w:t>
-      </w:r>
-      <w:r>
-        <w:rPr/>
-        <w:t xml:space="preserve"> </w:t>
-      </w:r>
-      <w:hyperlink r:id="rId68">
+          <w:highlight w:val="green"/>
+        </w:rPr>
+        <w:t xml:space="preserve">6</w:t>
+      </w:r>
+      <w:r>
+        <w:rPr>
+          <w:highlight w:val="green"/>
+        </w:rPr>
+        <w:t xml:space="preserve">, 5.</w:t>
+      </w:r>
+      <w:r>
+        <w:rPr>
+          <w:highlight w:val="green"/>
+        </w:rPr>
+        <w:t xml:space="preserve"> </w:t>
+      </w:r>
+      <w:hyperlink r:id="rId67">
         <w:r>
           <w:rPr>
             <w:rStyle w:val="Hyperlink"/>
+            <w:highlight w:val="green"/>
           </w:rPr>
-          <w:t xml:space="preserve">https://doi.org/10.1214/009053604000000265</w:t>
+          <w:t xml:space="preserve">https://doi.org/10.3390/data6010005</w:t>
         </w:r>
       </w:hyperlink>
       <w:r>
-        <w:rPr/>
+        <w:rPr>
+          <w:highlight w:val="green"/>
+        </w:rPr>
         <w:t xml:space="preserve">.</w:t>
       </w:r>
-      <w:bookmarkEnd w:id="143"/>
+      <w:bookmarkEnd w:id="142"/>
     </w:p>
     <w:p>
       <w:pPr>
@@ -31843,28 +31834,89 @@
         </w:numPr>
         <w:ind w:left="180" w:hanging="180"/>
       </w:pPr>
-      <w:bookmarkStart w:id="145" w:name="r-wadi"/>
-      <w:r>
-        <w:rPr/>
-        <w:t xml:space="preserve">Ahmed, C.M.; Palleti, V.R.; Mathur, A.P. WADI: A water distribution testbed for research in the design of secure cyber physical systems. In Proceedings of the 3rd International Workshop on Cyber-Physical Systems for Smart Water Networks (CySWATER), Pittsburgh, PA, USA, 21 April 2017; pp. 25–28.</w:t>
-      </w:r>
-      <w:r>
-        <w:rPr/>
-        <w:t xml:space="preserve"> </w:t>
-      </w:r>
-      <w:hyperlink r:id="rId69">
+      <w:bookmarkStart w:id="144" w:name="r-tsbuad"/>
+      <w:r>
+        <w:rPr>
+          <w:highlight w:val="green"/>
+        </w:rPr>
+        <w:t xml:space="preserve">Paparrizos, J.; Kang, Y.; Boniol, P.; Tsay, R.S.; Palpanas, T.; Franklin, M.J. TSB-UAD: An end-to-end benchmark suite for univariate time-series anomaly detection.</w:t>
+      </w:r>
+      <w:r>
+        <w:rPr>
+          <w:highlight w:val="green"/>
+        </w:rPr>
+        <w:t xml:space="preserve"> </w:t>
+      </w:r>
+      <w:r>
+        <w:rPr>
+          <w:i/>
+          <w:iCs/>
+          <w:highlight w:val="green"/>
+        </w:rPr>
+        <w:t xml:space="preserve">Proc. VLDB Endow.</w:t>
+      </w:r>
+      <w:r>
+        <w:rPr>
+          <w:highlight w:val="green"/>
+        </w:rPr>
+        <w:t xml:space="preserve"> </w:t>
+      </w:r>
+      <w:r>
+        <w:rPr>
+          <w:b/>
+          <w:bCs/>
+          <w:highlight w:val="green"/>
+        </w:rPr>
+        <w:t xml:space="preserve">2022</w:t>
+      </w:r>
+      <w:r>
+        <w:rPr>
+          <w:highlight w:val="green"/>
+        </w:rPr>
+        <w:t xml:space="preserve">,</w:t>
+      </w:r>
+      <w:r>
+        <w:rPr>
+          <w:highlight w:val="green"/>
+        </w:rPr>
+        <w:t xml:space="preserve"> </w:t>
+      </w:r>
+      <w:r>
+        <w:rPr>
+          <w:i/>
+          <w:iCs/>
+          <w:highlight w:val="green"/>
+        </w:rPr>
+        <w:t xml:space="preserve">15</w:t>
+      </w:r>
+      <w:r>
+        <w:rPr>
+          <w:highlight w:val="green"/>
+        </w:rPr>
+        <w:t xml:space="preserve">, 1697–1711.</w:t>
+      </w:r>
+      <w:r>
+        <w:rPr>
+          <w:highlight w:val="green"/>
+        </w:rPr>
+        <w:t xml:space="preserve"> </w:t>
+      </w:r>
+      <w:hyperlink r:id="rId68">
         <w:r>
           <w:rPr>
             <w:rStyle w:val="Hyperlink"/>
+            <w:highlight w:val="green"/>
           </w:rPr>
-          <w:t xml:space="preserve">https://doi.org/10.1145/3055366.3055375</w:t>
+          <w:t xml:space="preserve">https://doi.org/10.14778/3529337.3529354</w:t>
         </w:r>
       </w:hyperlink>
       <w:r>
-        <w:rPr/>
+        <w:rPr>
+          <w:highlight w:val="green"/>
+        </w:rPr>
         <w:t xml:space="preserve">.</w:t>
       </w:r>
-      <w:bookmarkEnd w:id="145"/>
+      <w:bookmarkEnd w:id="144"/>
     </w:p>
     <w:p>
       <w:pPr>
@@ -31875,28 +31927,69 @@
         </w:numPr>
         <w:ind w:left="180" w:hanging="180"/>
       </w:pPr>
-      <w:bookmarkStart w:id="147" w:name="r-hai"/>
-      <w:r>
-        <w:rPr/>
-        <w:t xml:space="preserve">Shin, H.-K.; Lee, W.; Yun, J.-H.; Kim, H. HAI 1.0: HIL-based augmented ICS security dataset. In Proceedings of the 13th USENIX Workshop on Cyber Security Experimentation and Test (CSET), Virtual, 10 August 2020.</w:t>
-      </w:r>
-      <w:r>
-        <w:rPr/>
-        <w:t xml:space="preserve"> </w:t>
-      </w:r>
-      <w:hyperlink r:id="rId70">
+      <w:bookmarkStart w:id="146" w:name="r-hc"/>
+      <w:r>
+        <w:rPr/>
+        <w:t xml:space="preserve">Donoho, D.; Jin, J. Higher criticism for detecting sparse heterogeneous mixtures.</w:t>
+      </w:r>
+      <w:r>
+        <w:rPr/>
+        <w:t xml:space="preserve"> </w:t>
+      </w:r>
+      <w:r>
+        <w:rPr>
+          <w:i/>
+          <w:iCs/>
+        </w:rPr>
+        <w:t xml:space="preserve">Ann. Stat.</w:t>
+      </w:r>
+      <w:r>
+        <w:rPr/>
+        <w:t xml:space="preserve"> </w:t>
+      </w:r>
+      <w:r>
+        <w:rPr>
+          <w:b/>
+          <w:bCs/>
+        </w:rPr>
+        <w:t xml:space="preserve">2004</w:t>
+      </w:r>
+      <w:r>
+        <w:rPr/>
+        <w:t xml:space="preserve">,</w:t>
+      </w:r>
+      <w:r>
+        <w:rPr/>
+        <w:t xml:space="preserve"> </w:t>
+      </w:r>
+      <w:r>
+        <w:rPr>
+          <w:i/>
+          <w:iCs/>
+        </w:rPr>
+        <w:t xml:space="preserve">32</w:t>
+      </w:r>
+      <w:r>
+        <w:rPr/>
+        <w:t xml:space="preserve">, 962–994.</w:t>
+      </w:r>
+      <w:r>
+        <w:rPr/>
+        <w:t xml:space="preserve"> </w:t>
+      </w:r>
+      <w:hyperlink r:id="rId69">
         <w:r>
           <w:rPr>
             <w:rStyle w:val="Hyperlink"/>
           </w:rPr>
-          <w:t xml:space="preserve">https://www.usenix.org/conference/cset20/presentation/shin</w:t>
+          <w:t xml:space="preserve">https://doi.org/10.1214/009053604000000265</w:t>
         </w:r>
       </w:hyperlink>
       <w:r>
         <w:rPr/>
         <w:t xml:space="preserve">.</w:t>
       </w:r>
-      <w:bookmarkEnd w:id="147"/>
+      <w:bookmarkEnd w:id="146"/>
     </w:p>
     <w:p>
       <w:pPr>
@@ -31907,28 +32000,28 @@
         </w:numPr>
         <w:ind w:left="180" w:hanging="180"/>
       </w:pPr>
-      <w:bookmarkStart w:id="149" w:name="r-swat"/>
-      <w:r>
-        <w:rPr/>
-        <w:t xml:space="preserve">Mathur, A.P.; Tippenhauer, N.O. SWaT: A water treatment testbed for research and training on ICS security. In Proceedings of the 2016 International Workshop on Cyber-Physical Systems for Smart Water Networks (CySWater), Vienna, Austria, 11 April 2016; pp. 31–36.</w:t>
-      </w:r>
-      <w:r>
-        <w:rPr/>
-        <w:t xml:space="preserve"> </w:t>
-      </w:r>
-      <w:hyperlink r:id="rId71">
+      <w:bookmarkStart w:id="148" w:name="r-wadi"/>
+      <w:r>
+        <w:rPr/>
+        <w:t xml:space="preserve">Ahmed, C.M.; Palleti, V.R.; Mathur, A.P. WADI: A water distribution testbed for research in the design of secure cyber physical systems. In Proceedings of the 3rd International Workshop on Cyber-Physical Systems for Smart Water Networks (CySWATER), Pittsburgh, PA, USA, 21 April 2017; pp. 25–28.</w:t>
+      </w:r>
+      <w:r>
+        <w:rPr/>
+        <w:t xml:space="preserve"> </w:t>
+      </w:r>
+      <w:hyperlink r:id="rId70">
         <w:r>
           <w:rPr>
             <w:rStyle w:val="Hyperlink"/>
           </w:rPr>
-          <w:t xml:space="preserve">https://doi.org/10.1109/CySWater.2016.7469060</w:t>
+          <w:t xml:space="preserve">https://doi.org/10.1145/3055366.3055375</w:t>
         </w:r>
       </w:hyperlink>
       <w:r>
         <w:rPr/>
         <w:t xml:space="preserve">.</w:t>
       </w:r>
-      <w:bookmarkEnd w:id="149"/>
+      <w:bookmarkEnd w:id="148"/>
     </w:p>
     <w:p>
       <w:pPr>
@@ -31939,89 +32032,28 @@
         </w:numPr>
         <w:ind w:left="180" w:hanging="180"/>
       </w:pPr>
-      <w:bookmarkStart w:id="151" w:name="r-metropt"/>
-      <w:r>
-        <w:rPr>
-          <w:highlight w:val="green"/>
-        </w:rPr>
-        <w:t xml:space="preserve">Veloso, B.; Ribeiro, R.P.; Gama, J.; Pereira, P.M. The MetroPT dataset for predictive maintenance.</w:t>
-      </w:r>
-      <w:r>
-        <w:rPr>
-          <w:highlight w:val="green"/>
-        </w:rPr>
-        <w:t xml:space="preserve"> </w:t>
-      </w:r>
-      <w:r>
-        <w:rPr>
-          <w:i/>
-          <w:iCs/>
-          <w:highlight w:val="green"/>
-        </w:rPr>
-        <w:t xml:space="preserve">Sci. Data</w:t>
-      </w:r>
-      <w:r>
-        <w:rPr>
-          <w:highlight w:val="green"/>
-        </w:rPr>
-        <w:t xml:space="preserve"> </w:t>
-      </w:r>
-      <w:r>
-        <w:rPr>
-          <w:b/>
-          <w:bCs/>
-          <w:highlight w:val="green"/>
-        </w:rPr>
-        <w:t xml:space="preserve">2022</w:t>
-      </w:r>
-      <w:r>
-        <w:rPr>
-          <w:highlight w:val="green"/>
-        </w:rPr>
-        <w:t xml:space="preserve">,</w:t>
-      </w:r>
-      <w:r>
-        <w:rPr>
-          <w:highlight w:val="green"/>
-        </w:rPr>
-        <w:t xml:space="preserve"> </w:t>
-      </w:r>
-      <w:r>
-        <w:rPr>
-          <w:i/>
-          <w:iCs/>
-          <w:highlight w:val="green"/>
-        </w:rPr>
-        <w:t xml:space="preserve">9</w:t>
-      </w:r>
-      <w:r>
-        <w:rPr>
-          <w:highlight w:val="green"/>
-        </w:rPr>
-        <w:t xml:space="preserve">, 764.</w:t>
-      </w:r>
-      <w:r>
-        <w:rPr>
-          <w:highlight w:val="green"/>
-        </w:rPr>
-        <w:t xml:space="preserve"> </w:t>
-      </w:r>
-      <w:hyperlink r:id="rId72">
+      <w:bookmarkStart w:id="150" w:name="r-hai"/>
+      <w:r>
+        <w:rPr/>
+        <w:t xml:space="preserve">Shin, H.-K.; Lee, W.; Yun, J.-H.; Kim, H. HAI 1.0: HIL-based augmented ICS security dataset. In Proceedings of the 13th USENIX Workshop on Cyber Security Experimentation and Test (CSET), Virtual, 10 August 2020.</w:t>
+      </w:r>
+      <w:r>
+        <w:rPr/>
+        <w:t xml:space="preserve"> </w:t>
+      </w:r>
+      <w:hyperlink r:id="rId71">
         <w:r>
           <w:rPr>
             <w:rStyle w:val="Hyperlink"/>
-            <w:highlight w:val="green"/>
           </w:rPr>
-          <w:t xml:space="preserve">https://doi.org/10.1038/s41597-022-01877-3</w:t>
+          <w:t xml:space="preserve">https://www.usenix.org/conference/cset20/presentation/shin</w:t>
         </w:r>
       </w:hyperlink>
       <w:r>
-        <w:rPr>
-          <w:highlight w:val="green"/>
-        </w:rPr>
+        <w:rPr/>
         <w:t xml:space="preserve">.</w:t>
       </w:r>
-      <w:bookmarkEnd w:id="151"/>
+      <w:bookmarkEnd w:id="150"/>
     </w:p>
     <w:p>
       <w:pPr>
@@ -32032,89 +32064,28 @@
         </w:numPr>
         <w:ind w:left="180" w:hanging="180"/>
       </w:pPr>
-      <w:bookmarkStart w:id="153" w:name="r-hivae"/>
-      <w:r>
-        <w:rPr>
-          <w:highlight w:val="green"/>
-        </w:rPr>
-        <w:t xml:space="preserve">Nazábal, A.; Olmos, P.M.; Ghahramani, Z.; Valera, I. Handling incomplete heterogeneous data using VAEs.</w:t>
-      </w:r>
-      <w:r>
-        <w:rPr>
-          <w:highlight w:val="green"/>
-        </w:rPr>
-        <w:t xml:space="preserve"> </w:t>
-      </w:r>
-      <w:r>
-        <w:rPr>
-          <w:i/>
-          <w:iCs/>
-          <w:highlight w:val="green"/>
-        </w:rPr>
-        <w:t xml:space="preserve">Pattern Recognit.</w:t>
-      </w:r>
-      <w:r>
-        <w:rPr>
-          <w:highlight w:val="green"/>
-        </w:rPr>
-        <w:t xml:space="preserve"> </w:t>
-      </w:r>
-      <w:r>
-        <w:rPr>
-          <w:b/>
-          <w:bCs/>
-          <w:highlight w:val="green"/>
-        </w:rPr>
-        <w:t xml:space="preserve">2020</w:t>
-      </w:r>
-      <w:r>
-        <w:rPr>
-          <w:highlight w:val="green"/>
-        </w:rPr>
-        <w:t xml:space="preserve">,</w:t>
-      </w:r>
-      <w:r>
-        <w:rPr>
-          <w:highlight w:val="green"/>
-        </w:rPr>
-        <w:t xml:space="preserve"> </w:t>
-      </w:r>
-      <w:r>
-        <w:rPr>
-          <w:i/>
-          <w:iCs/>
-          <w:highlight w:val="green"/>
-        </w:rPr>
-        <w:t xml:space="preserve">107</w:t>
-      </w:r>
-      <w:r>
-        <w:rPr>
-          <w:highlight w:val="green"/>
-        </w:rPr>
-        <w:t xml:space="preserve">, 107501.</w:t>
-      </w:r>
-      <w:r>
-        <w:rPr>
-          <w:highlight w:val="green"/>
-        </w:rPr>
-        <w:t xml:space="preserve"> </w:t>
-      </w:r>
-      <w:hyperlink r:id="rId73">
+      <w:bookmarkStart w:id="152" w:name="r-swat"/>
+      <w:r>
+        <w:rPr/>
+        <w:t xml:space="preserve">Mathur, A.P.; Tippenhauer, N.O. SWaT: A water treatment testbed for research and training on ICS security. In Proceedings of the 2016 International Workshop on Cyber-Physical Systems for Smart Water Networks (CySWater), Vienna, Austria, 11 April 2016; pp. 31–36.</w:t>
+      </w:r>
+      <w:r>
+        <w:rPr/>
+        <w:t xml:space="preserve"> </w:t>
+      </w:r>
+      <w:hyperlink r:id="rId72">
         <w:r>
           <w:rPr>
             <w:rStyle w:val="Hyperlink"/>
-            <w:highlight w:val="green"/>
           </w:rPr>
-          <w:t xml:space="preserve">https://doi.org/10.1016/j.patcog.2020.107501</w:t>
+          <w:t xml:space="preserve">https://doi.org/10.1109/CySWater.2016.7469060</w:t>
         </w:r>
       </w:hyperlink>
       <w:r>
-        <w:rPr>
-          <w:highlight w:val="green"/>
-        </w:rPr>
+        <w:rPr/>
         <w:t xml:space="preserve">.</w:t>
       </w:r>
-      <w:bookmarkEnd w:id="153"/>
+      <w:bookmarkEnd w:id="152"/>
     </w:p>
     <w:p>
       <w:pPr>
@@ -32125,12 +32096,12 @@
         </w:numPr>
         <w:ind w:left="180" w:hanging="180"/>
       </w:pPr>
-      <w:bookmarkStart w:id="155" w:name="r-vaem"/>
-      <w:r>
-        <w:rPr>
-          <w:highlight w:val="green"/>
-        </w:rPr>
-        <w:t xml:space="preserve">Ma, C.; Tschiatschek, S.; Hernández-Lobato, J.M.; Turner, R.; Zhang, C. VAEM: A deep generative model for heterogeneous mixed type data. In</w:t>
+      <w:bookmarkStart w:id="154" w:name="r-metropt"/>
+      <w:r>
+        <w:rPr>
+          <w:highlight w:val="green"/>
+        </w:rPr>
+        <w:t xml:space="preserve">Veloso, B.; Ribeiro, R.P.; Gama, J.; Pereira, P.M. The MetroPT dataset for predictive maintenance.</w:t>
       </w:r>
       <w:r>
         <w:rPr>
@@ -32144,27 +32115,61 @@
           <w:iCs/>
           <w:highlight w:val="green"/>
         </w:rPr>
-        <w:t xml:space="preserve">Advances in Neural Information Processing Systems 33 (NeurIPS)</w:t>
-      </w:r>
-      <w:r>
-        <w:rPr>
-          <w:highlight w:val="green"/>
-        </w:rPr>
-        <w:t xml:space="preserve">, Online, 6–12 December 2020; pp. 11237–11247.</w:t>
-      </w:r>
-      <w:r>
-        <w:rPr>
-          <w:highlight w:val="green"/>
-        </w:rPr>
-        <w:t xml:space="preserve"> </w:t>
-      </w:r>
-      <w:hyperlink r:id="rId74">
+        <w:t xml:space="preserve">Sci. Data</w:t>
+      </w:r>
+      <w:r>
+        <w:rPr>
+          <w:highlight w:val="green"/>
+        </w:rPr>
+        <w:t xml:space="preserve"> </w:t>
+      </w:r>
+      <w:r>
+        <w:rPr>
+          <w:b/>
+          <w:bCs/>
+          <w:highlight w:val="green"/>
+        </w:rPr>
+        <w:t xml:space="preserve">2022</w:t>
+      </w:r>
+      <w:r>
+        <w:rPr>
+          <w:highlight w:val="green"/>
+        </w:rPr>
+        <w:t xml:space="preserve">,</w:t>
+      </w:r>
+      <w:r>
+        <w:rPr>
+          <w:highlight w:val="green"/>
+        </w:rPr>
+        <w:t xml:space="preserve"> </w:t>
+      </w:r>
+      <w:r>
+        <w:rPr>
+          <w:i/>
+          <w:iCs/>
+          <w:highlight w:val="green"/>
+        </w:rPr>
+        <w:t xml:space="preserve">9</w:t>
+      </w:r>
+      <w:r>
+        <w:rPr>
+          <w:highlight w:val="green"/>
+        </w:rPr>
+        <w:t xml:space="preserve">, 764.</w:t>
+      </w:r>
+      <w:r>
+        <w:rPr>
+          <w:highlight w:val="green"/>
+        </w:rPr>
+        <w:t xml:space="preserve"> </w:t>
+      </w:r>
+      <w:hyperlink r:id="rId73">
         <w:r>
           <w:rPr>
             <w:rStyle w:val="Hyperlink"/>
             <w:highlight w:val="green"/>
           </w:rPr>
-          <w:t xml:space="preserve">arXiv:2006.11941</w:t>
+          <w:t xml:space="preserve">https://doi.org/10.1038/s41597-022-01877-3</w:t>
         </w:r>
       </w:hyperlink>
       <w:r>
@@ -32173,7 +32178,7 @@
         </w:rPr>
         <w:t xml:space="preserve">.</w:t>
       </w:r>
-      <w:bookmarkEnd w:id="155"/>
+      <w:bookmarkEnd w:id="154"/>
     </w:p>
     <w:p>
       <w:pPr>
@@ -32184,12 +32189,12 @@
         </w:numPr>
         <w:ind w:left="180" w:hanging="180"/>
       </w:pPr>
-      <w:bookmarkStart w:id="157" w:name="r-tabor"/>
-      <w:r>
-        <w:rPr>
-          <w:highlight w:val="green"/>
-        </w:rPr>
-        <w:t xml:space="preserve">Lin, Q.; Adepu, S.; Verwer, S.; Mathur, A. TABOR: A graphical model-based approach for anomaly detection in industrial control systems. In</w:t>
+      <w:bookmarkStart w:id="156" w:name="r-hivae"/>
+      <w:r>
+        <w:rPr>
+          <w:highlight w:val="green"/>
+        </w:rPr>
+        <w:t xml:space="preserve">Nazábal, A.; Olmos, P.M.; Ghahramani, Z.; Valera, I. Handling incomplete heterogeneous data using VAEs.</w:t>
       </w:r>
       <w:r>
         <w:rPr>
@@ -32203,27 +32208,61 @@
           <w:iCs/>
           <w:highlight w:val="green"/>
         </w:rPr>
-        <w:t xml:space="preserve">Proceedings of the 2018 ACM Asia Conference on Computer and Communications Security (ASIA CCS)</w:t>
-      </w:r>
-      <w:r>
-        <w:rPr>
-          <w:highlight w:val="green"/>
-        </w:rPr>
-        <w:t xml:space="preserve">, Incheon, Republic of Korea, 4–8 June 2018; pp. 525–536.</w:t>
-      </w:r>
-      <w:r>
-        <w:rPr>
-          <w:highlight w:val="green"/>
-        </w:rPr>
-        <w:t xml:space="preserve"> </w:t>
-      </w:r>
-      <w:hyperlink r:id="rId75">
+        <w:t xml:space="preserve">Pattern Recognit.</w:t>
+      </w:r>
+      <w:r>
+        <w:rPr>
+          <w:highlight w:val="green"/>
+        </w:rPr>
+        <w:t xml:space="preserve"> </w:t>
+      </w:r>
+      <w:r>
+        <w:rPr>
+          <w:b/>
+          <w:bCs/>
+          <w:highlight w:val="green"/>
+        </w:rPr>
+        <w:t xml:space="preserve">2020</w:t>
+      </w:r>
+      <w:r>
+        <w:rPr>
+          <w:highlight w:val="green"/>
+        </w:rPr>
+        <w:t xml:space="preserve">,</w:t>
+      </w:r>
+      <w:r>
+        <w:rPr>
+          <w:highlight w:val="green"/>
+        </w:rPr>
+        <w:t xml:space="preserve"> </w:t>
+      </w:r>
+      <w:r>
+        <w:rPr>
+          <w:i/>
+          <w:iCs/>
+          <w:highlight w:val="green"/>
+        </w:rPr>
+        <w:t xml:space="preserve">107</w:t>
+      </w:r>
+      <w:r>
+        <w:rPr>
+          <w:highlight w:val="green"/>
+        </w:rPr>
+        <w:t xml:space="preserve">, 107501.</w:t>
+      </w:r>
+      <w:r>
+        <w:rPr>
+          <w:highlight w:val="green"/>
+        </w:rPr>
+        <w:t xml:space="preserve"> </w:t>
+      </w:r>
+      <w:hyperlink r:id="rId74">
         <w:r>
           <w:rPr>
             <w:rStyle w:val="Hyperlink"/>
             <w:highlight w:val="green"/>
           </w:rPr>
-          <w:t xml:space="preserve">https://doi.org/10.1145/3196494.3196546</w:t>
+          <w:t xml:space="preserve">https://doi.org/10.1016/j.patcog.2020.107501</w:t>
         </w:r>
       </w:hyperlink>
       <w:r>
@@ -32232,7 +32271,7 @@
         </w:rPr>
         <w:t xml:space="preserve">.</w:t>
       </w:r>
-      <w:bookmarkEnd w:id="157"/>
+      <w:bookmarkEnd w:id="156"/>
     </w:p>
     <w:p>
       <w:pPr>
@@ -32243,16 +32282,16 @@
         </w:numPr>
         <w:ind w:left="180" w:hanging="180"/>
       </w:pPr>
-      <w:bookmarkStart w:id="159" w:name="r-calexnet"/>
-      <w:r>
-        <w:rPr>
-          <w:highlight w:val="yellow"/>
-        </w:rPr>
-        <w:t xml:space="preserve">Aperstein, Y.; Apartsin, A. CalexNet: Soft cascade-aligned training and calibration for lightweight early-exit branches.</w:t>
-      </w:r>
-      <w:r>
-        <w:rPr>
-          <w:highlight w:val="yellow"/>
+      <w:bookmarkStart w:id="158" w:name="r-vaem"/>
+      <w:r>
+        <w:rPr>
+          <w:highlight w:val="green"/>
+        </w:rPr>
+        <w:t xml:space="preserve">Ma, C.; Tschiatschek, S.; Hernández-Lobato, J.M.; Turner, R.; Zhang, C. VAEM: A deep generative model for heterogeneous mixed type data. In</w:t>
+      </w:r>
+      <w:r>
+        <w:rPr>
+          <w:highlight w:val="green"/>
         </w:rPr>
         <w:t xml:space="preserve"> </w:t>
       </w:r>
@@ -32260,72 +32299,38 @@
         <w:rPr>
           <w:i/>
           <w:iCs/>
-          <w:highlight w:val="yellow"/>
-        </w:rPr>
-        <w:t xml:space="preserve">Electronics</w:t>
-      </w:r>
-      <w:r>
-        <w:rPr>
-          <w:highlight w:val="yellow"/>
-        </w:rPr>
-        <w:t xml:space="preserve"> </w:t>
-      </w:r>
-      <w:r>
-        <w:rPr>
-          <w:b/>
-          <w:bCs/>
-          <w:highlight w:val="yellow"/>
-        </w:rPr>
-        <w:t xml:space="preserve">2026</w:t>
-      </w:r>
-      <w:r>
-        <w:rPr>
-          <w:highlight w:val="yellow"/>
-        </w:rPr>
-        <w:t xml:space="preserve">,</w:t>
-      </w:r>
-      <w:r>
-        <w:rPr>
-          <w:highlight w:val="yellow"/>
-        </w:rPr>
-        <w:t xml:space="preserve"> </w:t>
-      </w:r>
-      <w:r>
-        <w:rPr>
-          <w:i/>
-          <w:iCs/>
-          <w:highlight w:val="yellow"/>
-        </w:rPr>
-        <w:t xml:space="preserve">15</w:t>
-      </w:r>
-      <w:r>
-        <w:rPr>
-          <w:highlight w:val="yellow"/>
-        </w:rPr>
-        <w:t xml:space="preserve">, 2149.</w:t>
-      </w:r>
-      <w:r>
-        <w:rPr>
-          <w:highlight w:val="yellow"/>
-        </w:rPr>
-        <w:t xml:space="preserve"> </w:t>
-      </w:r>
-      <w:hyperlink r:id="rId76">
+          <w:highlight w:val="green"/>
+        </w:rPr>
+        <w:t xml:space="preserve">Advances in Neural Information Processing Systems 33 (NeurIPS)</w:t>
+      </w:r>
+      <w:r>
+        <w:rPr>
+          <w:highlight w:val="green"/>
+        </w:rPr>
+        <w:t xml:space="preserve">, Online, 6–12 December 2020; pp. 11237–11247.</w:t>
+      </w:r>
+      <w:r>
+        <w:rPr>
+          <w:highlight w:val="green"/>
+        </w:rPr>
+        <w:t xml:space="preserve"> </w:t>
+      </w:r>
+      <w:hyperlink r:id="rId75">
         <w:r>
           <w:rPr>
             <w:rStyle w:val="Hyperlink"/>
-            <w:highlight w:val="yellow"/>
+            <w:highlight w:val="green"/>
           </w:rPr>
-          <w:t xml:space="preserve">https://doi.org/10.3390/electronics15102149</w:t>
+          <w:t xml:space="preserve">arXiv:2006.11941</w:t>
         </w:r>
       </w:hyperlink>
       <w:r>
         <w:rPr>
-          <w:highlight w:val="yellow"/>
+          <w:highlight w:val="green"/>
         </w:rPr>
         <w:t xml:space="preserve">.</w:t>
       </w:r>
-      <w:bookmarkEnd w:id="159"/>
+      <w:bookmarkEnd w:id="158"/>
     </w:p>
     <w:p>
       <w:pPr>
@@ -32336,12 +32341,12 @@
         </w:numPr>
         <w:ind w:left="180" w:hanging="180"/>
       </w:pPr>
-      <w:bookmarkStart w:id="161" w:name="r-cranfield"/>
-      <w:r>
-        <w:rPr>
-          <w:highlight w:val="green"/>
-        </w:rPr>
-        <w:t xml:space="preserve">Ruiz-Cárcel, C.; Cao, Y.; Mba, D.; Lao, L.; Samuel, R.T. Statistical process monitoring of a multiphase flow facility.</w:t>
+      <w:bookmarkStart w:id="160" w:name="r-tabor"/>
+      <w:r>
+        <w:rPr>
+          <w:highlight w:val="green"/>
+        </w:rPr>
+        <w:t xml:space="preserve">Lin, Q.; Adepu, S.; Verwer, S.; Mathur, A. TABOR: A graphical model-based approach for anomaly detection in industrial control systems. In</w:t>
       </w:r>
       <w:r>
         <w:rPr>
@@ -32355,61 +32360,27 @@
           <w:iCs/>
           <w:highlight w:val="green"/>
         </w:rPr>
-        <w:t xml:space="preserve">Control Eng. Pract.</w:t>
-      </w:r>
-      <w:r>
-        <w:rPr>
-          <w:highlight w:val="green"/>
-        </w:rPr>
-        <w:t xml:space="preserve"> </w:t>
-      </w:r>
-      <w:r>
-        <w:rPr>
-          <w:b/>
-          <w:bCs/>
-          <w:highlight w:val="green"/>
-        </w:rPr>
-        <w:t xml:space="preserve">2015</w:t>
-      </w:r>
-      <w:r>
-        <w:rPr>
-          <w:highlight w:val="green"/>
-        </w:rPr>
-        <w:t xml:space="preserve">,</w:t>
-      </w:r>
-      <w:r>
-        <w:rPr>
-          <w:highlight w:val="green"/>
-        </w:rPr>
-        <w:t xml:space="preserve"> </w:t>
-      </w:r>
-      <w:r>
-        <w:rPr>
-          <w:i/>
-          <w:iCs/>
-          <w:highlight w:val="green"/>
-        </w:rPr>
-        <w:t xml:space="preserve">42</w:t>
-      </w:r>
-      <w:r>
-        <w:rPr>
-          <w:highlight w:val="green"/>
-        </w:rPr>
-        <w:t xml:space="preserve">, 74–88.</w:t>
-      </w:r>
-      <w:r>
-        <w:rPr>
-          <w:highlight w:val="green"/>
-        </w:rPr>
-        <w:t xml:space="preserve"> </w:t>
-      </w:r>
-      <w:hyperlink r:id="rId77">
+        <w:t xml:space="preserve">Proceedings of the 2018 ACM Asia Conference on Computer and Communications Security (ASIA CCS)</w:t>
+      </w:r>
+      <w:r>
+        <w:rPr>
+          <w:highlight w:val="green"/>
+        </w:rPr>
+        <w:t xml:space="preserve">, Incheon, Republic of Korea, 4–8 June 2018; pp. 525–536.</w:t>
+      </w:r>
+      <w:r>
+        <w:rPr>
+          <w:highlight w:val="green"/>
+        </w:rPr>
+        <w:t xml:space="preserve"> </w:t>
+      </w:r>
+      <w:hyperlink r:id="rId76">
         <w:r>
           <w:rPr>
             <w:rStyle w:val="Hyperlink"/>
             <w:highlight w:val="green"/>
           </w:rPr>
-          <w:t xml:space="preserve">https://doi.org/10.1016/j.conengprac.2015.04.012</w:t>
+          <w:t xml:space="preserve">https://doi.org/10.1145/3196494.3196546</w:t>
         </w:r>
       </w:hyperlink>
       <w:r>
@@ -32418,7 +32389,7 @@
         </w:rPr>
         <w:t xml:space="preserve">.</w:t>
       </w:r>
-      <w:bookmarkEnd w:id="161"/>
+      <w:bookmarkEnd w:id="160"/>
     </w:p>
     <w:p>
       <w:pPr>
@@ -32429,16 +32400,16 @@
         </w:numPr>
         <w:ind w:left="180" w:hanging="180"/>
       </w:pPr>
-      <w:bookmarkStart w:id="163" w:name="r-skab"/>
-      <w:r>
-        <w:rPr>
-          <w:highlight w:val="green"/>
-        </w:rPr>
-        <w:t xml:space="preserve">Katser, I.D.; Kozitsin, V.O. Skoltech Anomaly Benchmark (SKAB).</w:t>
-      </w:r>
-      <w:r>
-        <w:rPr>
-          <w:highlight w:val="green"/>
+      <w:bookmarkStart w:id="162" w:name="r-calexnet"/>
+      <w:r>
+        <w:rPr>
+          <w:highlight w:val="yellow"/>
+        </w:rPr>
+        <w:t xml:space="preserve">Aperstein, Y.; Apartsin, A. CalexNet: Soft cascade-aligned training and calibration for lightweight early-exit branches.</w:t>
+      </w:r>
+      <w:r>
+        <w:rPr>
+          <w:highlight w:val="yellow"/>
         </w:rPr>
         <w:t xml:space="preserve"> </w:t>
       </w:r>
@@ -32446,13 +32417,13 @@
         <w:rPr>
           <w:i/>
           <w:iCs/>
-          <w:highlight w:val="green"/>
-        </w:rPr>
-        <w:t xml:space="preserve">Kaggle</w:t>
-      </w:r>
-      <w:r>
-        <w:rPr>
-          <w:highlight w:val="green"/>
+          <w:highlight w:val="yellow"/>
+        </w:rPr>
+        <w:t xml:space="preserve">Electronics</w:t>
+      </w:r>
+      <w:r>
+        <w:rPr>
+          <w:highlight w:val="yellow"/>
         </w:rPr>
         <w:t xml:space="preserve"> </w:t>
       </w:r>
@@ -32460,6 +32431,192 @@
         <w:rPr>
           <w:b/>
           <w:bCs/>
+          <w:highlight w:val="yellow"/>
+        </w:rPr>
+        <w:t xml:space="preserve">2026</w:t>
+      </w:r>
+      <w:r>
+        <w:rPr>
+          <w:highlight w:val="yellow"/>
+        </w:rPr>
+        <w:t xml:space="preserve">,</w:t>
+      </w:r>
+      <w:r>
+        <w:rPr>
+          <w:highlight w:val="yellow"/>
+        </w:rPr>
+        <w:t xml:space="preserve"> </w:t>
+      </w:r>
+      <w:r>
+        <w:rPr>
+          <w:i/>
+          <w:iCs/>
+          <w:highlight w:val="yellow"/>
+        </w:rPr>
+        <w:t xml:space="preserve">15</w:t>
+      </w:r>
+      <w:r>
+        <w:rPr>
+          <w:highlight w:val="yellow"/>
+        </w:rPr>
+        <w:t xml:space="preserve">, 2149.</w:t>
+      </w:r>
+      <w:r>
+        <w:rPr>
+          <w:highlight w:val="yellow"/>
+        </w:rPr>
+        <w:t xml:space="preserve"> </w:t>
+      </w:r>
+      <w:hyperlink r:id="rId77">
+        <w:r>
+          <w:rPr>
+            <w:rStyle w:val="Hyperlink"/>
+            <w:highlight w:val="yellow"/>
+          </w:rPr>
+          <w:t xml:space="preserve">https://doi.org/10.3390/electronics15102149</w:t>
+        </w:r>
+      </w:hyperlink>
+      <w:r>
+        <w:rPr>
+          <w:highlight w:val="yellow"/>
+        </w:rPr>
+        <w:t xml:space="preserve">.</w:t>
+      </w:r>
+      <w:bookmarkEnd w:id="162"/>
+    </w:p>
+    <w:p>
+      <w:pPr>
+        <w:pStyle w:val="MDPI81references"/>
+        <w:numPr>
+          <w:ilvl w:val="0"/>
+          <w:numId w:val="0"/>
+        </w:numPr>
+        <w:ind w:left="180" w:hanging="180"/>
+      </w:pPr>
+      <w:bookmarkStart w:id="164" w:name="r-cranfield"/>
+      <w:r>
+        <w:rPr>
+          <w:highlight w:val="green"/>
+        </w:rPr>
+        <w:t xml:space="preserve">Ruiz-Cárcel, C.; Cao, Y.; Mba, D.; Lao, L.; Samuel, R.T. Statistical process monitoring of a multiphase flow facility.</w:t>
+      </w:r>
+      <w:r>
+        <w:rPr>
+          <w:highlight w:val="green"/>
+        </w:rPr>
+        <w:t xml:space="preserve"> </w:t>
+      </w:r>
+      <w:r>
+        <w:rPr>
+          <w:i/>
+          <w:iCs/>
+          <w:highlight w:val="green"/>
+        </w:rPr>
+        <w:t xml:space="preserve">Control Eng. Pract.</w:t>
+      </w:r>
+      <w:r>
+        <w:rPr>
+          <w:highlight w:val="green"/>
+        </w:rPr>
+        <w:t xml:space="preserve"> </w:t>
+      </w:r>
+      <w:r>
+        <w:rPr>
+          <w:b/>
+          <w:bCs/>
+          <w:highlight w:val="green"/>
+        </w:rPr>
+        <w:t xml:space="preserve">2015</w:t>
+      </w:r>
+      <w:r>
+        <w:rPr>
+          <w:highlight w:val="green"/>
+        </w:rPr>
+        <w:t xml:space="preserve">,</w:t>
+      </w:r>
+      <w:r>
+        <w:rPr>
+          <w:highlight w:val="green"/>
+        </w:rPr>
+        <w:t xml:space="preserve"> </w:t>
+      </w:r>
+      <w:r>
+        <w:rPr>
+          <w:i/>
+          <w:iCs/>
+          <w:highlight w:val="green"/>
+        </w:rPr>
+        <w:t xml:space="preserve">42</w:t>
+      </w:r>
+      <w:r>
+        <w:rPr>
+          <w:highlight w:val="green"/>
+        </w:rPr>
+        <w:t xml:space="preserve">, 74–88.</w:t>
+      </w:r>
+      <w:r>
+        <w:rPr>
+          <w:highlight w:val="green"/>
+        </w:rPr>
+        <w:t xml:space="preserve"> </w:t>
+      </w:r>
+      <w:hyperlink r:id="rId78">
+        <w:r>
+          <w:rPr>
+            <w:rStyle w:val="Hyperlink"/>
+            <w:highlight w:val="green"/>
+          </w:rPr>
+          <w:t xml:space="preserve">https://doi.org/10.1016/j.conengprac.2015.04.012</w:t>
+        </w:r>
+      </w:hyperlink>
+      <w:r>
+        <w:rPr>
+          <w:highlight w:val="green"/>
+        </w:rPr>
+        <w:t xml:space="preserve">.</w:t>
+      </w:r>
+      <w:bookmarkEnd w:id="164"/>
+    </w:p>
+    <w:p>
+      <w:pPr>
+        <w:pStyle w:val="MDPI81references"/>
+        <w:numPr>
+          <w:ilvl w:val="0"/>
+          <w:numId w:val="0"/>
+        </w:numPr>
+        <w:ind w:left="180" w:hanging="180"/>
+      </w:pPr>
+      <w:bookmarkStart w:id="166" w:name="r-skab"/>
+      <w:r>
+        <w:rPr>
+          <w:highlight w:val="green"/>
+        </w:rPr>
+        <w:t xml:space="preserve">Katser, I.D.; Kozitsin, V.O. Skoltech Anomaly Benchmark (SKAB).</w:t>
+      </w:r>
+      <w:r>
+        <w:rPr>
+          <w:highlight w:val="green"/>
+        </w:rPr>
+        <w:t xml:space="preserve"> </w:t>
+      </w:r>
+      <w:r>
+        <w:rPr>
+          <w:i/>
+          <w:iCs/>
+          <w:highlight w:val="green"/>
+        </w:rPr>
+        <w:t xml:space="preserve">Kaggle</w:t>
+      </w:r>
+      <w:r>
+        <w:rPr>
+          <w:highlight w:val="green"/>
+        </w:rPr>
+        <w:t xml:space="preserve"> </w:t>
+      </w:r>
+      <w:r>
+        <w:rPr>
+          <w:b/>
+          <w:bCs/>
           <w:highlight w:val="green"/>
         </w:rPr>
         <w:t xml:space="preserve">2020</w:t>
@@ -32476,7 +32633,7 @@
         </w:rPr>
         <w:t xml:space="preserve"> </w:t>
       </w:r>
-      <w:hyperlink r:id="rId78">
+      <w:hyperlink r:id="rId79">
         <w:r>
           <w:rPr>
             <w:rStyle w:val="Hyperlink"/>
@@ -32491,7 +32648,7 @@
         </w:rPr>
         <w:t xml:space="preserve">.</w:t>
       </w:r>
-      <w:bookmarkEnd w:id="163"/>
+      <w:bookmarkEnd w:id="166"/>
     </w:p>
     <w:sectPr>
       <w:headerReference w:type="even" r:id="rId12"/>

</xml_diff>